<commit_message>
Thêm bài báo quản lý SHTT trước yêu cầu chính sách mới; sửa tên tạp chí Võ 2025
- bai_bao_chinh_sach_moi_nd.py, bai_bao_chinh_sach_moi.py: bài báo theo khung
  (tóm tắt song ngữ, 6 phần, Bảng 1, Bảng 2, Hình 1, 12 tài liệu APA), dựng Word
  A4, Times New Roman 10,5, giãn dòng 11 pt, thân bài hai cột; tờ khai AI.
- so_do.py: thêm sơ đồ quy trình phối hợp cho Hình 1 bài báo.
- tai_lieu.py: Võ (2025) đăng trên Tạp chí Khoa học Đại học Mở Hà Nội, tr. 75-86.
- ban_chinh_sua.py: sửa thuộc tính zoom để tệp qua kiểm tra; giữ Excel gốc;
  dựng lại bản chỉnh sửa.

Co-Authored-By: Claude Opus 5.5 <noreply@anthropic.com>
Claude-Session: https://claude.ai/code/session_01ThGArqDrUUsqC1zG1BQvVL
</commit_message>
<xml_diff>
--- a/Ban_cuoi/Ban_chinh_sua_02-10-2026/Bao_cao_tong_ket_de_tai.docx
+++ b/Ban_cuoi/Ban_chinh_sua_02-10-2026/Bao_cao_tong_ket_de_tai.docx
@@ -22929,13 +22929,13 @@
           <w:szCs w:val="26"/>
           <w:i/>
         </w:rPr>
-        <w:t xml:space="preserve">Tạp chí Khoa học Đại học Mở Thành phố Hồ Chí Minh</w:t>
-      </w:r>
-      <w:r>
-        <w:rPr>
-          <w:szCs w:val="26"/>
-        </w:rPr>
-        <w:t xml:space="preserve">. https://doi.org/10.59266/houjs.2025.606</w:t>
+        <w:t xml:space="preserve">Tạp chí Khoa học Đại học Mở Hà Nội</w:t>
+      </w:r>
+      <w:r>
+        <w:rPr>
+          <w:szCs w:val="26"/>
+        </w:rPr>
+        <w:t xml:space="preserve">, 75-86. https://doi.org/10.59266/houjs.2025.606</w:t>
       </w:r>
     </w:p>
     <w:p>

</xml_diff>

<commit_message>
Sửa báo cáo theo góp ý lần 2: luồng nộp đơn sớm, mức độ kết luận, NĐ 267/2025
- Chương 3: quy trình 8 khâu có luồng sớm từ Khâu 3 sang Khâu 6, nghiệm thu là bước
  kiểm tra; điều kiện chi theo kết quả Khâu 3; sơ đồ, Bảng 3.3, 3.4, thí điểm đồng bộ;
  danh mục số quản lý nội bộ có phân quyền, chỉ công khai dữ liệu được phép.
- Chương 2, Kết luận: thống nhất mức độ kết luận (giả thuyết, chưa xác định được
  xung đột); phép ghép tên tính theo người, người trùng họ tên không gán, ghi là
  phân tích thăm dò trên danh sách năm 2026.
- Chương 1: tách phân loại pháp lý với phân nhóm quản lý; căn cứ xác lập, thời hạn
  theo từng đối tượng; hợp đồng phân biệt theo nội dung quyền; thêm NĐ 267/2025.
- Kiến nghị chỉ nêu vấn đề NĐ 267/2025 chưa nêu rõ; sửa tên tạp chí bài Võ (2025).
- Bảng giải trình có căn cứ góp ý lần 2; thêm điểm chưa đủ minh chứng.

Co-Authored-By: Claude Opus 5.5 <noreply@anthropic.com>
Claude-Session: https://claude.ai/code/session_01ThGArqDrUUsqC1zG1BQvVL
</commit_message>
<xml_diff>
--- a/Ban_cuoi/Ban_chinh_sua_02-10-2026/Bao_cao_tong_ket_de_tai.docx
+++ b/Ban_cuoi/Ban_chinh_sua_02-10-2026/Bao_cao_tong_ket_de_tai.docx
@@ -389,7 +389,7 @@
       </w:r>
       <w:r>
         <w:rPr/>
-        <w:t xml:space="preserve">3</w:t>
+        <w:t xml:space="preserve">4</w:t>
       </w:r>
     </w:p>
     <w:p>
@@ -537,7 +537,7 @@
       </w:r>
       <w:r>
         <w:rPr/>
-        <w:t xml:space="preserve">8</w:t>
+        <w:t xml:space="preserve">9</w:t>
       </w:r>
     </w:p>
     <w:p>
@@ -561,7 +561,7 @@
       </w:r>
       <w:r>
         <w:rPr/>
-        <w:t xml:space="preserve">10</w:t>
+        <w:t xml:space="preserve">11</w:t>
       </w:r>
     </w:p>
     <w:p>
@@ -585,7 +585,7 @@
       </w:r>
       <w:r>
         <w:rPr/>
-        <w:t xml:space="preserve">10</w:t>
+        <w:t xml:space="preserve">11</w:t>
       </w:r>
     </w:p>
     <w:p>
@@ -609,7 +609,7 @@
       </w:r>
       <w:r>
         <w:rPr/>
-        <w:t xml:space="preserve">10</w:t>
+        <w:t xml:space="preserve">11</w:t>
       </w:r>
     </w:p>
     <w:p>
@@ -633,7 +633,7 @@
       </w:r>
       <w:r>
         <w:rPr/>
-        <w:t xml:space="preserve">11</w:t>
+        <w:t xml:space="preserve">12</w:t>
       </w:r>
     </w:p>
     <w:p>
@@ -657,7 +657,7 @@
       </w:r>
       <w:r>
         <w:rPr/>
-        <w:t xml:space="preserve">12</w:t>
+        <w:t xml:space="preserve">13</w:t>
       </w:r>
     </w:p>
     <w:p>
@@ -681,7 +681,7 @@
       </w:r>
       <w:r>
         <w:rPr/>
-        <w:t xml:space="preserve">12</w:t>
+        <w:t xml:space="preserve">13</w:t>
       </w:r>
     </w:p>
     <w:p>
@@ -705,7 +705,7 @@
       </w:r>
       <w:r>
         <w:rPr/>
-        <w:t xml:space="preserve">15</w:t>
+        <w:t xml:space="preserve">16</w:t>
       </w:r>
     </w:p>
     <w:p>
@@ -729,7 +729,7 @@
       </w:r>
       <w:r>
         <w:rPr/>
-        <w:t xml:space="preserve">17</w:t>
+        <w:t xml:space="preserve">19</w:t>
       </w:r>
     </w:p>
     <w:p>
@@ -753,7 +753,7 @@
       </w:r>
       <w:r>
         <w:rPr/>
-        <w:t xml:space="preserve">18</w:t>
+        <w:t xml:space="preserve">20</w:t>
       </w:r>
     </w:p>
     <w:p>
@@ -777,7 +777,7 @@
       </w:r>
       <w:r>
         <w:rPr/>
-        <w:t xml:space="preserve">19</w:t>
+        <w:t xml:space="preserve">21</w:t>
       </w:r>
     </w:p>
     <w:p>
@@ -801,7 +801,7 @@
       </w:r>
       <w:r>
         <w:rPr/>
-        <w:t xml:space="preserve">19</w:t>
+        <w:t xml:space="preserve">21</w:t>
       </w:r>
     </w:p>
     <w:p>
@@ -825,7 +825,7 @@
       </w:r>
       <w:r>
         <w:rPr/>
-        <w:t xml:space="preserve">20</w:t>
+        <w:t xml:space="preserve">22</w:t>
       </w:r>
     </w:p>
     <w:p>
@@ -849,7 +849,7 @@
       </w:r>
       <w:r>
         <w:rPr/>
-        <w:t xml:space="preserve">21</w:t>
+        <w:t xml:space="preserve">23</w:t>
       </w:r>
     </w:p>
     <w:p>
@@ -873,7 +873,7 @@
       </w:r>
       <w:r>
         <w:rPr/>
-        <w:t xml:space="preserve">22</w:t>
+        <w:t xml:space="preserve">24</w:t>
       </w:r>
     </w:p>
     <w:p>
@@ -897,7 +897,7 @@
       </w:r>
       <w:r>
         <w:rPr/>
-        <w:t xml:space="preserve">22</w:t>
+        <w:t xml:space="preserve">24</w:t>
       </w:r>
     </w:p>
     <w:p>
@@ -921,7 +921,7 @@
       </w:r>
       <w:r>
         <w:rPr/>
-        <w:t xml:space="preserve">24</w:t>
+        <w:t xml:space="preserve">26</w:t>
       </w:r>
     </w:p>
     <w:p>
@@ -945,7 +945,7 @@
       </w:r>
       <w:r>
         <w:rPr/>
-        <w:t xml:space="preserve">25</w:t>
+        <w:t xml:space="preserve">27</w:t>
       </w:r>
     </w:p>
     <w:p>
@@ -969,7 +969,7 @@
       </w:r>
       <w:r>
         <w:rPr/>
-        <w:t xml:space="preserve">26</w:t>
+        <w:t xml:space="preserve">28</w:t>
       </w:r>
     </w:p>
     <w:p>
@@ -997,7 +997,7 @@
         <w:rPr>
           <w:b/>
         </w:rPr>
-        <w:t xml:space="preserve">28</w:t>
+        <w:t xml:space="preserve">30</w:t>
       </w:r>
     </w:p>
     <w:p>
@@ -1021,7 +1021,7 @@
       </w:r>
       <w:r>
         <w:rPr/>
-        <w:t xml:space="preserve">28</w:t>
+        <w:t xml:space="preserve">30</w:t>
       </w:r>
     </w:p>
     <w:p>
@@ -1045,7 +1045,7 @@
       </w:r>
       <w:r>
         <w:rPr/>
-        <w:t xml:space="preserve">28</w:t>
+        <w:t xml:space="preserve">30</w:t>
       </w:r>
     </w:p>
     <w:p>
@@ -1069,7 +1069,7 @@
       </w:r>
       <w:r>
         <w:rPr/>
-        <w:t xml:space="preserve">29</w:t>
+        <w:t xml:space="preserve">31</w:t>
       </w:r>
     </w:p>
     <w:p>
@@ -1093,7 +1093,7 @@
       </w:r>
       <w:r>
         <w:rPr/>
-        <w:t xml:space="preserve">32</w:t>
+        <w:t xml:space="preserve">34</w:t>
       </w:r>
     </w:p>
     <w:p>
@@ -1117,7 +1117,7 @@
       </w:r>
       <w:r>
         <w:rPr/>
-        <w:t xml:space="preserve">32</w:t>
+        <w:t xml:space="preserve">34</w:t>
       </w:r>
     </w:p>
     <w:p>
@@ -1141,7 +1141,7 @@
       </w:r>
       <w:r>
         <w:rPr/>
-        <w:t xml:space="preserve">37</w:t>
+        <w:t xml:space="preserve">39</w:t>
       </w:r>
     </w:p>
     <w:p>
@@ -1165,7 +1165,7 @@
       </w:r>
       <w:r>
         <w:rPr/>
-        <w:t xml:space="preserve">38</w:t>
+        <w:t xml:space="preserve">40</w:t>
       </w:r>
     </w:p>
     <w:p>
@@ -1189,7 +1189,7 @@
       </w:r>
       <w:r>
         <w:rPr/>
-        <w:t xml:space="preserve">41</w:t>
+        <w:t xml:space="preserve">44</w:t>
       </w:r>
     </w:p>
     <w:p>
@@ -1213,7 +1213,7 @@
       </w:r>
       <w:r>
         <w:rPr/>
-        <w:t xml:space="preserve">42</w:t>
+        <w:t xml:space="preserve">45</w:t>
       </w:r>
     </w:p>
     <w:p>
@@ -1237,7 +1237,7 @@
       </w:r>
       <w:r>
         <w:rPr/>
-        <w:t xml:space="preserve">42</w:t>
+        <w:t xml:space="preserve">45</w:t>
       </w:r>
     </w:p>
     <w:p>
@@ -1261,7 +1261,7 @@
       </w:r>
       <w:r>
         <w:rPr/>
-        <w:t xml:space="preserve">43</w:t>
+        <w:t xml:space="preserve">46</w:t>
       </w:r>
     </w:p>
     <w:p>
@@ -1285,7 +1285,7 @@
       </w:r>
       <w:r>
         <w:rPr/>
-        <w:t xml:space="preserve">46</w:t>
+        <w:t xml:space="preserve">48</w:t>
       </w:r>
     </w:p>
     <w:p>
@@ -1309,7 +1309,7 @@
       </w:r>
       <w:r>
         <w:rPr/>
-        <w:t xml:space="preserve">49</w:t>
+        <w:t xml:space="preserve">51</w:t>
       </w:r>
     </w:p>
     <w:p>
@@ -1333,7 +1333,7 @@
       </w:r>
       <w:r>
         <w:rPr/>
-        <w:t xml:space="preserve">50</w:t>
+        <w:t xml:space="preserve">52</w:t>
       </w:r>
     </w:p>
     <w:p>
@@ -1357,7 +1357,7 @@
       </w:r>
       <w:r>
         <w:rPr/>
-        <w:t xml:space="preserve">51</w:t>
+        <w:t xml:space="preserve">54</w:t>
       </w:r>
     </w:p>
     <w:p>
@@ -1381,7 +1381,7 @@
       </w:r>
       <w:r>
         <w:rPr/>
-        <w:t xml:space="preserve">52</w:t>
+        <w:t xml:space="preserve">55</w:t>
       </w:r>
     </w:p>
     <w:p>
@@ -1405,7 +1405,7 @@
       </w:r>
       <w:r>
         <w:rPr/>
-        <w:t xml:space="preserve">53</w:t>
+        <w:t xml:space="preserve">56</w:t>
       </w:r>
     </w:p>
     <w:p>
@@ -1429,7 +1429,7 @@
       </w:r>
       <w:r>
         <w:rPr/>
-        <w:t xml:space="preserve">55</w:t>
+        <w:t xml:space="preserve">58</w:t>
       </w:r>
     </w:p>
     <w:p>
@@ -1457,7 +1457,7 @@
         <w:rPr>
           <w:b/>
         </w:rPr>
-        <w:t xml:space="preserve">57</w:t>
+        <w:t xml:space="preserve">59</w:t>
       </w:r>
     </w:p>
     <w:p>
@@ -1481,7 +1481,7 @@
       </w:r>
       <w:r>
         <w:rPr/>
-        <w:t xml:space="preserve">57</w:t>
+        <w:t xml:space="preserve">59</w:t>
       </w:r>
     </w:p>
     <w:p>
@@ -1505,7 +1505,7 @@
       </w:r>
       <w:r>
         <w:rPr/>
-        <w:t xml:space="preserve">57</w:t>
+        <w:t xml:space="preserve">59</w:t>
       </w:r>
     </w:p>
     <w:p>
@@ -1529,7 +1529,7 @@
       </w:r>
       <w:r>
         <w:rPr/>
-        <w:t xml:space="preserve">60</w:t>
+        <w:t xml:space="preserve">62</w:t>
       </w:r>
     </w:p>
     <w:p>
@@ -1553,7 +1553,7 @@
       </w:r>
       <w:r>
         <w:rPr/>
-        <w:t xml:space="preserve">63</w:t>
+        <w:t xml:space="preserve">65</w:t>
       </w:r>
     </w:p>
     <w:p>
@@ -1577,7 +1577,7 @@
       </w:r>
       <w:r>
         <w:rPr/>
-        <w:t xml:space="preserve">64</w:t>
+        <w:t xml:space="preserve">66</w:t>
       </w:r>
     </w:p>
     <w:p>
@@ -1601,7 +1601,7 @@
       </w:r>
       <w:r>
         <w:rPr/>
-        <w:t xml:space="preserve">64</w:t>
+        <w:t xml:space="preserve">66</w:t>
       </w:r>
     </w:p>
     <w:p>
@@ -1625,7 +1625,7 @@
       </w:r>
       <w:r>
         <w:rPr/>
-        <w:t xml:space="preserve">67</w:t>
+        <w:t xml:space="preserve">69</w:t>
       </w:r>
     </w:p>
     <w:p>
@@ -1649,7 +1649,7 @@
       </w:r>
       <w:r>
         <w:rPr/>
-        <w:t xml:space="preserve">69</w:t>
+        <w:t xml:space="preserve">71</w:t>
       </w:r>
     </w:p>
     <w:p>
@@ -1673,7 +1673,7 @@
       </w:r>
       <w:r>
         <w:rPr/>
-        <w:t xml:space="preserve">72</w:t>
+        <w:t xml:space="preserve">75</w:t>
       </w:r>
     </w:p>
     <w:p>
@@ -1697,7 +1697,7 @@
       </w:r>
       <w:r>
         <w:rPr/>
-        <w:t xml:space="preserve">74</w:t>
+        <w:t xml:space="preserve">77</w:t>
       </w:r>
     </w:p>
     <w:p>
@@ -1721,7 +1721,7 @@
       </w:r>
       <w:r>
         <w:rPr/>
-        <w:t xml:space="preserve">75</w:t>
+        <w:t xml:space="preserve">78</w:t>
       </w:r>
     </w:p>
     <w:p>
@@ -1745,7 +1745,7 @@
       </w:r>
       <w:r>
         <w:rPr/>
-        <w:t xml:space="preserve">77</w:t>
+        <w:t xml:space="preserve">80</w:t>
       </w:r>
     </w:p>
     <w:p>
@@ -1769,7 +1769,7 @@
       </w:r>
       <w:r>
         <w:rPr/>
-        <w:t xml:space="preserve">77</w:t>
+        <w:t xml:space="preserve">80</w:t>
       </w:r>
     </w:p>
     <w:p>
@@ -1793,7 +1793,7 @@
       </w:r>
       <w:r>
         <w:rPr/>
-        <w:t xml:space="preserve">77</w:t>
+        <w:t xml:space="preserve">80</w:t>
       </w:r>
     </w:p>
     <w:p>
@@ -1817,7 +1817,7 @@
       </w:r>
       <w:r>
         <w:rPr/>
-        <w:t xml:space="preserve">78</w:t>
+        <w:t xml:space="preserve">81</w:t>
       </w:r>
     </w:p>
     <w:p>
@@ -1841,7 +1841,7 @@
       </w:r>
       <w:r>
         <w:rPr/>
-        <w:t xml:space="preserve">78</w:t>
+        <w:t xml:space="preserve">81</w:t>
       </w:r>
     </w:p>
     <w:p>
@@ -1865,7 +1865,7 @@
       </w:r>
       <w:r>
         <w:rPr/>
-        <w:t xml:space="preserve">80</w:t>
+        <w:t xml:space="preserve">83</w:t>
       </w:r>
     </w:p>
     <w:p>
@@ -1889,7 +1889,7 @@
       </w:r>
       <w:r>
         <w:rPr/>
-        <w:t xml:space="preserve">82</w:t>
+        <w:t xml:space="preserve">85</w:t>
       </w:r>
     </w:p>
     <w:p>
@@ -1917,7 +1917,7 @@
         <w:rPr>
           <w:b/>
         </w:rPr>
-        <w:t xml:space="preserve">83</w:t>
+        <w:t xml:space="preserve">86</w:t>
       </w:r>
     </w:p>
     <w:p>
@@ -1941,7 +1941,7 @@
       </w:r>
       <w:r>
         <w:rPr/>
-        <w:t xml:space="preserve">83</w:t>
+        <w:t xml:space="preserve">86</w:t>
       </w:r>
     </w:p>
     <w:p>
@@ -1965,7 +1965,7 @@
       </w:r>
       <w:r>
         <w:rPr/>
-        <w:t xml:space="preserve">83</w:t>
+        <w:t xml:space="preserve">87</w:t>
       </w:r>
     </w:p>
     <w:p>
@@ -1989,7 +1989,7 @@
       </w:r>
       <w:r>
         <w:rPr/>
-        <w:t xml:space="preserve">84</w:t>
+        <w:t xml:space="preserve">87</w:t>
       </w:r>
     </w:p>
     <w:p>
@@ -2017,7 +2017,7 @@
         <w:rPr>
           <w:b/>
         </w:rPr>
-        <w:t xml:space="preserve">85</w:t>
+        <w:t xml:space="preserve">89</w:t>
       </w:r>
       <w:r>
         <w:fldChar w:fldCharType="end"/>
@@ -2072,7 +2072,7 @@
       </w:r>
       <w:r>
         <w:rPr/>
-        <w:t xml:space="preserve">21</w:t>
+        <w:t xml:space="preserve">22</w:t>
       </w:r>
     </w:p>
     <w:p>
@@ -2096,7 +2096,7 @@
       </w:r>
       <w:r>
         <w:rPr/>
-        <w:t xml:space="preserve">28</w:t>
+        <w:t xml:space="preserve">30</w:t>
       </w:r>
     </w:p>
     <w:p>
@@ -2120,7 +2120,7 @@
       </w:r>
       <w:r>
         <w:rPr/>
-        <w:t xml:space="preserve">29</w:t>
+        <w:t xml:space="preserve">31</w:t>
       </w:r>
     </w:p>
     <w:p>
@@ -2144,7 +2144,7 @@
       </w:r>
       <w:r>
         <w:rPr/>
-        <w:t xml:space="preserve">33</w:t>
+        <w:t xml:space="preserve">35</w:t>
       </w:r>
     </w:p>
     <w:p>
@@ -2168,7 +2168,7 @@
       </w:r>
       <w:r>
         <w:rPr/>
-        <w:t xml:space="preserve">38</w:t>
+        <w:t xml:space="preserve">40</w:t>
       </w:r>
     </w:p>
     <w:p>
@@ -2192,7 +2192,7 @@
       </w:r>
       <w:r>
         <w:rPr/>
-        <w:t xml:space="preserve">42</w:t>
+        <w:t xml:space="preserve">45</w:t>
       </w:r>
     </w:p>
     <w:p>
@@ -2216,7 +2216,7 @@
       </w:r>
       <w:r>
         <w:rPr/>
-        <w:t xml:space="preserve">43</w:t>
+        <w:t xml:space="preserve">46</w:t>
       </w:r>
     </w:p>
     <w:p>
@@ -2240,7 +2240,7 @@
       </w:r>
       <w:r>
         <w:rPr/>
-        <w:t xml:space="preserve">46</w:t>
+        <w:t xml:space="preserve">48</w:t>
       </w:r>
     </w:p>
     <w:p>
@@ -2264,7 +2264,7 @@
       </w:r>
       <w:r>
         <w:rPr/>
-        <w:t xml:space="preserve">60</w:t>
+        <w:t xml:space="preserve">62</w:t>
       </w:r>
     </w:p>
     <w:p>
@@ -2288,7 +2288,7 @@
       </w:r>
       <w:r>
         <w:rPr/>
-        <w:t xml:space="preserve">62</w:t>
+        <w:t xml:space="preserve">64</w:t>
       </w:r>
     </w:p>
     <w:p>
@@ -2312,7 +2312,7 @@
       </w:r>
       <w:r>
         <w:rPr/>
-        <w:t xml:space="preserve">76</w:t>
+        <w:t xml:space="preserve">78</w:t>
       </w:r>
     </w:p>
     <w:p>
@@ -2336,7 +2336,7 @@
       </w:r>
       <w:r>
         <w:rPr/>
-        <w:t xml:space="preserve">80</w:t>
+        <w:t xml:space="preserve">83</w:t>
       </w:r>
       <w:r>
         <w:fldChar w:fldCharType="end"/>
@@ -2391,7 +2391,7 @@
       </w:r>
       <w:r>
         <w:rPr/>
-        <w:t xml:space="preserve">20</w:t>
+        <w:t xml:space="preserve">22</w:t>
       </w:r>
     </w:p>
     <w:p>
@@ -2415,7 +2415,7 @@
       </w:r>
       <w:r>
         <w:rPr/>
-        <w:t xml:space="preserve">22</w:t>
+        <w:t xml:space="preserve">24</w:t>
       </w:r>
     </w:p>
     <w:p>
@@ -2439,7 +2439,7 @@
       </w:r>
       <w:r>
         <w:rPr/>
-        <w:t xml:space="preserve">26</w:t>
+        <w:t xml:space="preserve">28</w:t>
       </w:r>
     </w:p>
     <w:p>
@@ -2463,7 +2463,7 @@
       </w:r>
       <w:r>
         <w:rPr/>
-        <w:t xml:space="preserve">31</w:t>
+        <w:t xml:space="preserve">33</w:t>
       </w:r>
     </w:p>
     <w:p>
@@ -2487,7 +2487,7 @@
       </w:r>
       <w:r>
         <w:rPr/>
-        <w:t xml:space="preserve">35</w:t>
+        <w:t xml:space="preserve">37</w:t>
       </w:r>
     </w:p>
     <w:p>
@@ -2511,7 +2511,7 @@
       </w:r>
       <w:r>
         <w:rPr/>
-        <w:t xml:space="preserve">37</w:t>
+        <w:t xml:space="preserve">40</w:t>
       </w:r>
     </w:p>
     <w:p>
@@ -2535,7 +2535,7 @@
       </w:r>
       <w:r>
         <w:rPr/>
-        <w:t xml:space="preserve">39</w:t>
+        <w:t xml:space="preserve">42</w:t>
       </w:r>
     </w:p>
     <w:p>
@@ -2559,7 +2559,7 @@
       </w:r>
       <w:r>
         <w:rPr/>
-        <w:t xml:space="preserve">40</w:t>
+        <w:t xml:space="preserve">43</w:t>
       </w:r>
     </w:p>
     <w:p>
@@ -2583,7 +2583,7 @@
       </w:r>
       <w:r>
         <w:rPr/>
-        <w:t xml:space="preserve">41</w:t>
+        <w:t xml:space="preserve">44</w:t>
       </w:r>
     </w:p>
     <w:p>
@@ -2607,7 +2607,7 @@
       </w:r>
       <w:r>
         <w:rPr/>
-        <w:t xml:space="preserve">45</w:t>
+        <w:t xml:space="preserve">47</w:t>
       </w:r>
     </w:p>
     <w:p>
@@ -2631,7 +2631,7 @@
       </w:r>
       <w:r>
         <w:rPr/>
-        <w:t xml:space="preserve">47</w:t>
+        <w:t xml:space="preserve">50</w:t>
       </w:r>
     </w:p>
     <w:p>
@@ -2655,7 +2655,7 @@
       </w:r>
       <w:r>
         <w:rPr/>
-        <w:t xml:space="preserve">48</w:t>
+        <w:t xml:space="preserve">50</w:t>
       </w:r>
     </w:p>
     <w:p>
@@ -2679,7 +2679,7 @@
       </w:r>
       <w:r>
         <w:rPr/>
-        <w:t xml:space="preserve">50</w:t>
+        <w:t xml:space="preserve">53</w:t>
       </w:r>
     </w:p>
     <w:p>
@@ -2703,7 +2703,7 @@
       </w:r>
       <w:r>
         <w:rPr/>
-        <w:t xml:space="preserve">55</w:t>
+        <w:t xml:space="preserve">57</w:t>
       </w:r>
     </w:p>
     <w:p>
@@ -2727,7 +2727,7 @@
       </w:r>
       <w:r>
         <w:rPr/>
-        <w:t xml:space="preserve">68</w:t>
+        <w:t xml:space="preserve">70</w:t>
       </w:r>
     </w:p>
     <w:p>
@@ -2744,14 +2744,14 @@
       </w:pPr>
       <w:r>
         <w:rPr/>
-        <w:t xml:space="preserve">Hình 3.2. Quy trình 8 khâu quản lý tài sản trí tuệ từ khai báo đến khai thác, kèm phân nhánh theo loại đối tượng</w:t>
+        <w:t xml:space="preserve">Hình 3.2. Quy trình 8 khâu quản lý tài sản trí tuệ từ khai báo đến khai thác, kèm luồng nộp đơn sớm và phân nhánh theo loại đối tượng</w:t>
       </w:r>
       <w:r>
         <w:tab/>
       </w:r>
       <w:r>
         <w:rPr/>
-        <w:t xml:space="preserve">70</w:t>
+        <w:t xml:space="preserve">72</w:t>
       </w:r>
     </w:p>
     <w:p>
@@ -2785,7 +2785,7 @@
       </w:r>
       <w:r>
         <w:rPr/>
-        <w:t xml:space="preserve">78</w:t>
+        <w:t xml:space="preserve">81</w:t>
       </w:r>
       <w:r>
         <w:fldChar w:fldCharType="end"/>
@@ -3125,20 +3125,20 @@
         <w:rPr>
           <w:szCs w:val="26"/>
         </w:rPr>
-        <w:t xml:space="preserve">Phương pháp phân tích văn bản được dùng để đối chiếu từng điều khoản của Quy chế ban hành kèm Quyết định 213, Quy chế ban hành kèm Quyết định 217, Quy chế chi tiêu nội bộ và Kế hoạch số 07/KH-ĐHTĐ với Luật Sở hữu trí tuệ hợp nhất, Luật số 93/2025/QH15 và các văn bản hướng dẫn. Dữ liệu định lượng gồm 582 bản ghi sản phẩm khoa học giai đoạn 2021 - 2025 từ các danh mục thống kê của Phòng Khoa học Công nghệ, hồ sơ 38 đề tài cấp cơ sở, danh mục theo dõi đơn và văn bằng của Nhà trường và danh sách 252 nhân sự năm 2026; dữ liệu cá nhân chỉ được sử dụng ở dạng tổng hợp.</w:t>
-      </w:r>
-    </w:p>
-    <w:p>
-      <w:pPr>
-        <w:rPr>
-          <w:szCs w:val="26"/>
-        </w:rPr>
-      </w:pPr>
-      <w:r>
-        <w:rPr>
-          <w:szCs w:val="26"/>
-        </w:rPr>
-        <w:t xml:space="preserve">Các danh mục được làm sạch và chuẩn hóa tên đơn vị; năm của mỗi số liệu được xác định rõ theo mã số, năm phê duyệt, năm nghiệm thu, năm nộp đơn hoặc năm cấp văn bằng. Do các danh mục dùng đơn vị thống kê khác nhau và không có trường liên kết, 582 bản ghi được giữ là tổng số bản ghi, không quy đổi thành số sản phẩm độc lập. Tên tác giả bài báo được so khớp với danh sách nhân sự theo quy tắc giữ dấu, kèm phân tích độ nhạy với quy tắc bỏ dấu. Hồ sơ tài sản trí tuệ được phân loại theo bốn nhóm trạng thái pháp lý: đã nộp đơn, đã chấp nhận đơn hợp lệ, đã cấp văn bằng hoặc giấy chứng nhận, chưa xác minh. Sản phẩm của từng đề tài được đánh giá sơ bộ theo đối tượng quyền dự kiến; các quy định về lợi ích của tác giả được đối chiếu theo phạm vi, đối tượng hưởng, cơ sở tính và điều kiện áp dụng. Mức độ tập trung công bố được đo bằng hệ số Gini; mức độ hoàn thành kế hoạch được tính theo tỷ lệ thực hiện so với chỉ tiêu. Kết quả phân tích được tổng hợp bằng ma trận điểm mạnh, điểm yếu, thời cơ và thách thức làm căn cứ đề xuất giải pháp.</w:t>
+        <w:t xml:space="preserve">Phương pháp phân tích văn bản được dùng để đối chiếu từng điều khoản của Quy chế ban hành kèm Quyết định 213, Quy chế ban hành kèm Quyết định 217, Quy chế chi tiêu nội bộ và Kế hoạch số 07/KH-ĐHTĐ với Luật Sở hữu trí tuệ hợp nhất, Luật số 93/2025/QH15, Nghị định số 267/2025/NĐ-CP và các văn bản hướng dẫn. Dữ liệu định lượng gồm 582 bản ghi sản phẩm khoa học giai đoạn 2021 - 2025 từ các danh mục thống kê của Phòng Khoa học Công nghệ, hồ sơ 38 đề tài cấp cơ sở, danh mục theo dõi đơn và văn bằng của Nhà trường và danh sách 252 nhân sự năm 2026; dữ liệu cá nhân chỉ được sử dụng ở dạng tổng hợp.</w:t>
+      </w:r>
+    </w:p>
+    <w:p>
+      <w:pPr>
+        <w:rPr>
+          <w:szCs w:val="26"/>
+        </w:rPr>
+      </w:pPr>
+      <w:r>
+        <w:rPr>
+          <w:szCs w:val="26"/>
+        </w:rPr>
+        <w:t xml:space="preserve">Các danh mục được làm sạch và chuẩn hóa tên đơn vị; năm của mỗi số liệu được xác định rõ theo mã số, năm phê duyệt, năm nghiệm thu, năm nộp đơn hoặc năm cấp văn bằng. Do các danh mục dùng đơn vị thống kê khác nhau và không có trường liên kết, 582 bản ghi được giữ là tổng số bản ghi, không quy đổi thành số sản phẩm độc lập. Tên tác giả bài báo được so khớp với danh sách nhân sự năm 2026 theo quy tắc giữ dấu, kèm phân tích độ nhạy với quy tắc bỏ dấu; đơn vị đếm là người, người trùng họ tên với người khác không được gán bài báo, và kết quả được coi là phân tích thăm dò vì danh sách năm 2026 không trùng với đội ngũ từng năm của kỳ đánh giá. Hồ sơ tài sản trí tuệ được phân loại theo bốn nhóm trạng thái pháp lý: đã nộp đơn, đã chấp nhận đơn hợp lệ, đã cấp văn bằng hoặc giấy chứng nhận, chưa xác minh. Sản phẩm của từng đề tài được đánh giá sơ bộ theo đối tượng quyền dự kiến; các quy định về lợi ích của tác giả được đối chiếu theo phạm vi, đối tượng hưởng, cơ sở tính và điều kiện áp dụng. Mức độ tập trung công bố được đo bằng hệ số Gini; mức độ hoàn thành kế hoạch được tính theo tỷ lệ thực hiện so với chỉ tiêu. Kết quả phân tích được tổng hợp bằng ma trận điểm mạnh, điểm yếu, thời cơ và thách thức làm căn cứ đề xuất giải pháp.</w:t>
       </w:r>
     </w:p>
     <w:p>
@@ -3175,7 +3175,7 @@
         <w:rPr>
           <w:szCs w:val="26"/>
         </w:rPr>
-        <w:t xml:space="preserve"> Đề tài cung cấp một khung phân tích và bộ tiêu chí đánh giá hiệu quả quản lý quyền sở hữu trí tuệ có thể tính toán từ dữ liệu hành chính của trường đại học, đồng thời chỉ ra vai trò của khâu rà soát tại thời điểm nghiệm thu trong chuỗi chuyển hóa từ đề tài sang văn bằng.</w:t>
+        <w:t xml:space="preserve"> Đề tài cung cấp một khung phân tích và bộ tiêu chí đánh giá hiệu quả quản lý quyền sở hữu trí tuệ có thể tính toán từ dữ liệu hành chính của trường đại học, đồng thời đề xuất giả thuyết về vai trò của bước sàng lọc trước khi công bố và rà soát tại nghiệm thu trong chuỗi chuyển hóa từ đề tài sang văn bằng, kèm cách đo để kiểm chứng.</w:t>
       </w:r>
     </w:p>
     <w:p>
@@ -3446,20 +3446,20 @@
         <w:rPr>
           <w:szCs w:val="26"/>
         </w:rPr>
-        <w:t xml:space="preserve">Để xác lập cơ chế bảo hộ cho các khối tài sản vô hình đó, quyền sở hữu trí tuệ được thiết lập như một khung pháp lý chuyên biệt. Các điều ước quốc tế như Công ước Stockholm năm 1967 về thành lập Tổ chức Sở hữu trí tuệ thế giới hay Hiệp định về các khía cạnh liên quan tới thương mại của quyền sở hữu trí tuệ đều xác định quyền sở hữu trí tuệ là quyền độc quyền có thời hạn trao cho chủ thể sáng tạo nhằm khai thác, sử dụng, định đoạt và ngăn chặn hành vi sao chép trái phép. Tại Việt Nam, Điều 4 Luật Sở hữu trí tuệ quy định quyền sở hữu trí tuệ là quyền của tổ chức, cá nhân đối với tài sản trí tuệ, bao gồm quyền tác giả và quyền liên quan, quyền sở hữu công nghiệp và quyền đối với giống cây trồng (Văn phòng Quốc hội, 2026).</w:t>
-      </w:r>
-    </w:p>
-    <w:p>
-      <w:pPr>
-        <w:rPr>
-          <w:szCs w:val="26"/>
-        </w:rPr>
-      </w:pPr>
-      <w:r>
-        <w:rPr>
-          <w:szCs w:val="26"/>
-        </w:rPr>
-        <w:t xml:space="preserve">Trong cơ sở giáo dục đại học, quyền sở hữu trí tuệ được phân thành ba nhóm cấu thành chủ yếu:</w:t>
+        <w:t xml:space="preserve">Để xác lập cơ chế bảo hộ cho các khối tài sản vô hình đó, quyền sở hữu trí tuệ được thiết lập như một khung pháp lý chuyên biệt. Các điều ước quốc tế không đưa ra một định nghĩa khái quát mà xác định quyền sở hữu trí tuệ bằng cách liệt kê các nhóm quyền: Công ước Stockholm năm 1967 về thành lập Tổ chức Sở hữu trí tuệ thế giới liệt kê các quyền đối với tác phẩm văn học, nghệ thuật, khoa học, cuộc biểu diễn, bản ghi âm, chương trình phát sóng, sáng chế, phát minh khoa học, kiểu dáng công nghiệp, nhãn hiệu, tên thương mại và quyền chống cạnh tranh không lành mạnh; Hiệp định về các khía cạnh liên quan tới thương mại của quyền sở hữu trí tuệ xác định phạm vi gồm các nhóm quyền được quy định từ Mục 1 đến Mục 7 Phần II của Hiệp định. Tại Việt Nam, khoản 1 Điều 4 Luật Sở hữu trí tuệ quy định quyền sở hữu trí tuệ là quyền của tổ chức, cá nhân đối với các đối tượng quyền tác giả và quyền liên quan, quyền sở hữu công nghiệp và quyền đối với giống cây trồng (Văn phòng Quốc hội, 2026).</w:t>
+      </w:r>
+    </w:p>
+    <w:p>
+      <w:pPr>
+        <w:rPr>
+          <w:szCs w:val="26"/>
+        </w:rPr>
+      </w:pPr>
+      <w:r>
+        <w:rPr>
+          <w:szCs w:val="26"/>
+        </w:rPr>
+        <w:t xml:space="preserve">Cần phân biệt phân loại pháp lý với cách phân nhóm phục vụ quản lý. Về pháp lý, khoản 4 Điều 4 Luật Sở hữu trí tuệ xác định quyền sở hữu công nghiệp là quyền đối với sáng chế, kiểu dáng công nghiệp, thiết kế bố trí mạch tích hợp bán dẫn, nhãn hiệu, tên thương mại, chỉ dẫn địa lý, bí mật kinh doanh và quyền chống cạnh tranh không lành mạnh; như vậy nhãn hiệu và tên thương mại thuộc quyền sở hữu công nghiệp. Trên cơ sở phân loại này, để phục vụ công tác quản lý trong trường, tài sản trí tuệ có thể được chia thành ba nhóm theo nguồn hình thành và đơn vị chịu trách nhiệm; đây là cách phân nhóm quản lý, không thay thế phân loại pháp lý:</w:t>
       </w:r>
     </w:p>
     <w:p>
@@ -3485,20 +3485,20 @@
         <w:rPr>
           <w:szCs w:val="26"/>
         </w:rPr>
-        <w:t xml:space="preserve">- Nhóm quyền sở hữu công nghiệp: Gắn với sáng chế, giải pháp hữu ích, kiểu dáng công nghiệp, thiết kế bố trí và bí mật kinh doanh phát sinh từ các đề tài nghiên cứu khoa học và dự án phát triển công nghệ.</w:t>
-      </w:r>
-    </w:p>
-    <w:p>
-      <w:pPr>
-        <w:rPr>
-          <w:szCs w:val="26"/>
-        </w:rPr>
-      </w:pPr>
-      <w:r>
-        <w:rPr>
-          <w:szCs w:val="26"/>
-        </w:rPr>
-        <w:t xml:space="preserve">- Nhóm nhãn hiệu và chỉ dẫn thương mại: Gắn với tên trường, biểu trưng, khẩu hiệu và các dấu hiệu nhận diện thương hiệu gắn liền với uy tín đào tạo và nghiên cứu của nhà trường.</w:t>
+        <w:t xml:space="preserve">- Nhóm tài sản công nghệ, thuộc quyền sở hữu công nghiệp: Gắn với sáng chế, giải pháp hữu ích, kiểu dáng công nghiệp, thiết kế bố trí và bí mật kinh doanh phát sinh từ các đề tài nghiên cứu khoa học và dự án phát triển công nghệ.</w:t>
+      </w:r>
+    </w:p>
+    <w:p>
+      <w:pPr>
+        <w:rPr>
+          <w:szCs w:val="26"/>
+        </w:rPr>
+      </w:pPr>
+      <w:r>
+        <w:rPr>
+          <w:szCs w:val="26"/>
+        </w:rPr>
+        <w:t xml:space="preserve">- Nhóm tài sản nhận diện, cũng thuộc quyền sở hữu công nghiệp: Gắn với nhãn hiệu, tên thương mại của trường, biểu trưng, khẩu hiệu và các dấu hiệu nhận diện thương hiệu gắn liền với uy tín đào tạo và nghiên cứu của nhà trường. Nhóm này được tách riêng với nhóm tài sản công nghệ vì nguồn hình thành, đơn vị quản lý và cách khai thác khác nhau.</w:t>
       </w:r>
     </w:p>
     <w:p>
@@ -3694,13 +3694,13 @@
           <w:szCs w:val="26"/>
           <w:b/>
         </w:rPr>
-        <w:t xml:space="preserve">Tính giới hạn về thời gian và lãnh thổ bảo hộ:</w:t>
-      </w:r>
-      <w:r>
-        <w:rPr>
-          <w:szCs w:val="26"/>
-        </w:rPr>
-        <w:t xml:space="preserve"> Quyền sở hữu công nghiệp chỉ được bảo hộ trong phạm vi quốc gia đăng ký và có thời hạn luật định (sáng chế 20 năm, giải pháp hữu ích 10 năm). Điều này đặt ra yêu cầu nhà trường phải có chiến lược nộp đơn kịp thời và kế hoạch khai thác trong khoảng thời gian công nghệ chưa bị lạc hậu.</w:t>
+        <w:t xml:space="preserve">Tính lãnh thổ và sự khác biệt về căn cứ xác lập, thời hạn bảo hộ:</w:t>
+      </w:r>
+      <w:r>
+        <w:rPr>
+          <w:szCs w:val="26"/>
+        </w:rPr>
+        <w:t xml:space="preserve"> Văn bằng bảo hộ do Việt Nam cấp có hiệu lực trên lãnh thổ Việt Nam theo khoản 1 Điều 93 Luật Sở hữu trí tuệ, nên muốn được bảo hộ ở nước khác phải nộp đơn tại nước đó hoặc theo điều ước quốc tế. Căn cứ xác lập quyền khác nhau giữa các đối tượng theo Điều 6: quyền tác giả phát sinh khi tác phẩm được sáng tạo và thể hiện dưới một hình thức vật chất nhất định, không phụ thuộc vào việc đăng ký; quyền đối với sáng chế, kiểu dáng công nghiệp, thiết kế bố trí, nhãn hiệu được xác lập trên cơ sở quyết định cấp văn bằng, trừ nhãn hiệu nổi tiếng được xác lập trên cơ sở sử dụng; quyền đối với tên thương mại được xác lập trên cơ sở sử dụng hợp pháp; quyền đối với bí mật kinh doanh được xác lập trên cơ sở có được một cách hợp pháp và thực hiện việc bảo mật. Thời hạn bảo hộ cũng khác nhau: theo Điều 93, bằng độc quyền sáng chế có hiệu lực đến hết 20 năm và bằng độc quyền giải pháp hữu ích đến hết 10 năm kể từ ngày nộp đơn, kiểu dáng công nghiệp 5 năm và được gia hạn hai lần, nhãn hiệu 10 năm và được gia hạn nhiều lần, chỉ dẫn địa lý vô thời hạn; bí mật kinh doanh được bảo hộ chừng nào còn đáp ứng các điều kiện tại Điều 84; theo khoản 1 Điều 27, một số quyền nhân thân của tác giả được bảo hộ vô thời hạn. Đặc điểm này đòi hỏi nhà trường chọn hình thức bảo hộ phù hợp từng đối tượng và có kế hoạch nộp đơn, khai thác kịp thời đối với các đối tượng có thời hạn ngắn.</w:t>
       </w:r>
     </w:p>
     <w:p>
@@ -3811,7 +3811,7 @@
         <w:rPr>
           <w:szCs w:val="26"/>
         </w:rPr>
-        <w:t xml:space="preserve">Xác lập quyền là quá trình thực hiện các trình tự, thủ tục pháp lý tại cơ quan nhà nước có thẩm quyền nhằm xác nhận quyền sở hữu hợp pháp đối với tài sản trí tuệ. Đối với quyền sở hữu công nghiệp (sáng chế, giải pháp hữu ích, kiểu dáng, nhãn hiệu), quyền chỉ phát sinh trên cơ sở quyết định cấp văn bằng bảo hộ sau khi trải qua các giai đoạn thẩm định hình thức, công bố đơn và thẩm định nội dung. Đối với quyền tác giả (giáo trình, bài giảng, phần mềm), quyền phát sinh tự động ngay khi tác phẩm được định hình dưới hình thức vật chất nhất định; tuy nhiên, thủ tục đăng ký để được cấp Giấy chứng nhận đăng ký quyền tác giả giữ vai trò là bằng chứng pháp lý vững chắc phục vụ việc quản lý, chuyển giao và chứng minh quyền khi có tranh chấp.</w:t>
+        <w:t xml:space="preserve">Xác lập quyền là việc làm phát sinh hoặc xác nhận quyền sở hữu hợp pháp đối với tài sản trí tuệ theo căn cứ quy định tại Điều 6 Luật Sở hữu trí tuệ, và căn cứ này khác nhau giữa các đối tượng. Đối với sáng chế, giải pháp hữu ích, kiểu dáng công nghiệp, thiết kế bố trí và nhãn hiệu, quyền được xác lập trên cơ sở quyết định cấp văn bằng bảo hộ sau các giai đoạn thẩm định theo thủ tục đăng ký, trừ nhãn hiệu nổi tiếng. Đối với tên thương mại, quyền được xác lập trên cơ sở sử dụng hợp pháp; đối với bí mật kinh doanh, trên cơ sở có được một cách hợp pháp và thực hiện việc bảo mật, nên công việc của nhà trường là thiết lập và duy trì biện pháp bảo mật chứ không phải nộp đơn. Đối với quyền tác giả (giáo trình, bài giảng, phần mềm), quyền phát sinh tự động ngay khi tác phẩm được định hình dưới hình thức vật chất nhất định; tuy nhiên, thủ tục đăng ký để được cấp Giấy chứng nhận đăng ký quyền tác giả giữ vai trò là bằng chứng pháp lý vững chắc phục vụ việc quản lý, chuyển giao và chứng minh quyền khi có tranh chấp.</w:t>
       </w:r>
     </w:p>
     <w:p>
@@ -3931,20 +3931,20 @@
         <w:rPr>
           <w:szCs w:val="26"/>
         </w:rPr>
-        <w:t xml:space="preserve">1. Chuyển nhượng toàn bộ quyền sở hữu trí tuệ cho doanh nghiệp để thu về khoản tiền trọn gói một lần.</w:t>
-      </w:r>
-    </w:p>
-    <w:p>
-      <w:pPr>
-        <w:rPr>
-          <w:szCs w:val="26"/>
-        </w:rPr>
-      </w:pPr>
-      <w:r>
-        <w:rPr>
-          <w:szCs w:val="26"/>
-        </w:rPr>
-        <w:t xml:space="preserve">2. Cấp phép quyền sử dụng (độc quyền hoặc không độc quyền) để thu tiền bản quyền định kỳ tính theo tỷ lệ phần trăm doanh thu sản phẩm.</w:t>
+        <w:t xml:space="preserve">1. Chuyển nhượng quyền: chủ sở hữu chuyển giao quyền sở hữu của mình cho tổ chức, cá nhân khác, theo Điều 138 Luật Sở hữu trí tuệ đối với quyền sở hữu công nghiệp và Điều 45 đối với quyền tác giả, quyền liên quan.</w:t>
+      </w:r>
+    </w:p>
+    <w:p>
+      <w:pPr>
+        <w:rPr>
+          <w:szCs w:val="26"/>
+        </w:rPr>
+      </w:pPr>
+      <w:r>
+        <w:rPr>
+          <w:szCs w:val="26"/>
+        </w:rPr>
+        <w:t xml:space="preserve">2. Chuyển quyền sử dụng, thường gọi là cấp phép: chủ sở hữu cho phép tổ chức, cá nhân khác sử dụng đối tượng trong phạm vi và thời hạn nhất định, theo Điều 141 và Điều 47, dưới dạng độc quyền, không độc quyền hoặc thứ cấp theo Điều 143. Hai loại hợp đồng được phân biệt theo việc quyền sở hữu có được chuyển giao hay không; giá và phương thức thanh toán, như trả trọn gói, trả theo kỳ, trả theo tỷ lệ doanh thu hoặc kết hợp, là nội dung do các bên thỏa thuận theo Điều 140 và Điều 144, áp dụng được cho cả hai loại.</w:t>
       </w:r>
     </w:p>
     <w:p>
@@ -4115,7 +4115,7 @@
         <w:rPr>
           <w:szCs w:val="26"/>
         </w:rPr>
-        <w:t xml:space="preserve">- Thu nhập từ chuyển giao công nghệ và cấp phép quyền sử dụng: Các sáng chế, giải pháp kỹ thuật, phần mềm ứng dụng khi được thương mại hóa thành công sẽ đem lại dòng tiền bản quyền định kỳ, tạo nguồn tài chính hợp pháp ngoài học phí.</w:t>
+        <w:t xml:space="preserve">- Thu nhập từ chuyển giao công nghệ và cấp phép quyền sử dụng: Các sáng chế, giải pháp kỹ thuật, phần mềm ứng dụng khi được thương mại hóa thành công có thể đem lại khoản thu từ hợp đồng chuyển nhượng hoặc chuyển quyền sử dụng, tạo nguồn tài chính hợp pháp ngoài học phí.</w:t>
       </w:r>
     </w:p>
     <w:p>
@@ -4461,6 +4461,19 @@
           <w:szCs w:val="26"/>
         </w:rPr>
         <w:t xml:space="preserve">Về áp dụng theo thời gian, khoản 3 Điều 73 quy định nhiệm vụ khoa học và công nghệ đã được phê duyệt giao chủ trì trước ngày 01 tháng 10 năm 2025 tiếp tục thực hiện theo Luật Khoa học và công nghệ số 29/2013/QH13, Nghị quyết số 193/2025/QH15 và văn bản hướng dẫn có hiệu lực tại thời điểm phê duyệt. Khoản 7 Điều 73 quy định ngoại lệ: Điều 28 được áp dụng đối với lợi nhuận chưa phân chia từ thương mại hóa sáng chế, kiểu dáng công nghiệp, thiết kế bố trí, giống cây trồng là kết quả của nhiệm vụ được giao từ ngày 01 tháng 01 năm 2023 đến trước ngày 01 tháng 10 năm 2025 và đã được cấp văn bằng bảo hộ. Như vậy, để xác định nghĩa vụ đối với tác giả trong một trường hợp cụ thể cần trả lời đồng thời ba câu hỏi: kết quả có sử dụng ngân sách nhà nước hay không và ở phần nào; nhiệm vụ được giao vào thời điểm nào; đối tượng có phải là sáng chế, kiểu dáng công nghiệp, thiết kế bố trí đã được bảo hộ hay không.</w:t>
+      </w:r>
+    </w:p>
+    <w:p>
+      <w:pPr>
+        <w:rPr>
+          <w:szCs w:val="26"/>
+        </w:rPr>
+      </w:pPr>
+      <w:r>
+        <w:rPr>
+          <w:szCs w:val="26"/>
+        </w:rPr>
+        <w:t xml:space="preserve">Nghị định số 267/2025/NĐ-CP ngày 14 tháng 10 năm 2025 của Chính phủ, có hiệu lực từ cùng ngày, quy định chi tiết Điều 25, Điều 27, Điều 28 và một số điều khác của Luật số 93/2025/QH15. Ba nhóm nội dung liên quan trực tiếp đến cơ sở giáo dục đại học tư thục. Một là, khoản 2 Điều 32 quy định tổ chức chủ trì không phải là cơ quan nhà nước, đơn vị sự nghiệp công lập được Nhà nước giao tự động quyền sở hữu phần kết quả tương ứng với kinh phí từ ngân sách nhà nước, không cần thủ tục giao quyền và bàn giao tài sản; tổ chức theo dõi riêng thông tin về kết quả, không hạch toán chung vào tài sản, và tự quyết định phương án phát triển, ứng dụng hoặc thương mại hóa theo Điều 27 của Luật; khoản 6 Điều 32 khẳng định tổ chức được giao quyền có quyền đăng ký bảo hộ. Hai là, Điều 34 yêu cầu việc phân chia lợi nhuận bảo đảm công khai, minh bạch; đối với kết quả sử dụng ngân sách nhà nước, việc phân chia thực hiện theo khoản 3 Điều 28 của Luật; tổ chức trung gian, môi giới hưởng tối thiểu 10% lợi nhuận thu được từ thương mại hóa, trừ khi các bên có thỏa thuận khác; phần thưởng cho tác giả khi có đồng tác giả được chia theo thỏa thuận giữa các đồng tác giả. Điểm g khoản 2 Điều 17 bổ sung yêu cầu hồ sơ đánh giá cuối kỳ có văn bản xác định mức độ đóng góp của thành viên, có xác nhận của các thành viên, làm căn cứ phân chia lợi nhuận. Ba là, khoản 2 Điều 56 nhắc lại nguyên tắc nhiệm vụ được phê duyệt trước ngày 01 tháng 10 năm 2025 tiếp tục thực hiện theo văn bản có hiệu lực tại thời điểm phê duyệt, còn khoản 3 Điều 56 quy định việc xử lý kết quả của các nhiệm vụ này, nếu chưa có quyết định xử lý, được thực hiện theo Nghị định; Nghị định số 70/2018/NĐ-CP về quản lý, sử dụng tài sản hình thành từ nhiệm vụ khoa học và công nghệ sử dụng vốn nhà nước hết hiệu lực. Nghị định không quy định phương pháp xác định lợi nhuận sau thuế tương ứng với một kết quả cụ thể khi kết quả được hình thành từ nhiều nguồn kinh phí; nội dung này cần được tổ chức chủ trì quy định trong quy chế nội bộ.</w:t>
       </w:r>
     </w:p>
     <w:p>
@@ -9470,7 +9483,7 @@
         <w:rPr>
           <w:szCs w:val="26"/>
         </w:rPr>
-        <w:t>Tính trên toàn bộ nhân sự, gồm cả khối hành chính, 252 người trong danh sách năm 2026 tương ứng 246 tên khác nhau do có 6 trường hợp trùng họ tên. Theo quy tắc so khớp giữ dấu và đúng thứ tự họ tên, 87 trên 246 tên, tức 35,4%, đứng tên ít nhất một bài báo trong năm năm; hệ số Gini về số bài là 0,832, và trong nhóm có công bố, 10% người dẫn đầu chiếm 39,7% số lượt đứng tên. Nếu chấp nhận cả cách viết không dấu trong bài quốc tế, số tên có bài là 103, tức 41,9%, và hệ số Gini là 0,822; nhận định về mức độ tập trung không đổi giữa hai quy tắc. Lực lượng nghiên cứu nòng cốt vì vậy còn tương đối mỏng so với quy mô Nhà trường. Viện Y - Dược là nơi phát sinh 9 trên 11 sản phẩm đề tài có tiềm năng tạo lập tài sản trí tuệ và đơn sáng chế duy nhất trong kỳ; số lượng công bố và khả năng hình thành tài sản trí tuệ là hai thước đo khác nhau, cần được theo dõi riêng.</w:t>
+        <w:t>Phân tích thăm dò dưới đây đối chiếu danh sách tác giả của hai danh mục bài báo với 252 người trong danh sách nhân sự năm 2026, gồm cả khối hành chính. Danh sách năm 2026 không gồm người đã nghỉ và có người mới tuyển, nên kết quả không phản ánh đúng đội ngũ từng năm 2021 - 2025. Đơn vị đếm là người; 12 người thuộc 6 nhóm trùng họ tên là những người khác nhau nhưng không phân biệt được trong danh mục bài báo, nên không được gán bài; trong đó 8 người có họ tên xuất hiện trong danh sách tác giả. Trong 240 người còn lại, theo quy tắc so khớp giữ dấu và đúng thứ tự họ tên, 83 người, tức 34,6%, đứng tên ít nhất một bài báo trong năm năm; hệ số Gini về số bài là 0,836, và trong nhóm có công bố, 10% người dẫn đầu chiếm 38,3% số lượt đứng tên. Nếu chấp nhận cả cách viết không dấu trong bài quốc tế, số người có bài là 99, tức 41,2%, và hệ số Gini là 0,827. Kết quả gợi ý hoạt động công bố tập trung ở một nhóm tương đối nhỏ trong số nhân sự hiện tại; muốn kết luận về quy mô lực lượng nghiên cứu cần đối chiếu theo mã nhân sự với danh sách từng năm. Viện Y - Dược là nơi phát sinh 9 trên 11 sản phẩm đề tài có tiềm năng tạo lập tài sản trí tuệ và đơn sáng chế duy nhất trong kỳ; số lượng công bố và khả năng hình thành tài sản trí tuệ là hai thước đo khác nhau, cần được theo dõi riêng.</w:t>
       </w:r>
     </w:p>
     <w:p>
@@ -10567,7 +10580,7 @@
         <w:rPr>
           <w:szCs w:val="26"/>
         </w:rPr>
-        <w:t>Hình 2.2 cho thấy, trên cùng nguồn thu sau chi phí, phần dành cho tác giả theo hai điểm bằng nhau cho đến khoảng 333 triệu đồng; từ mức này, phần theo điểm a không tăng thêm do mức trần 100 triệu đồng một đề tài. Vì hai điểm áp dụng cho hai phạm vi khác nhau, khác biệt này không phải là xung đột giữa hai quy định mà thể hiện tác động của mức trần đối với đề tài sử dụng ngân sách nhà nước.</w:t>
+        <w:t>Hình 2.2 cho thấy, trên cùng nguồn thu sau chi phí, phần dành cho tác giả theo hai điểm bằng nhau cho đến khoảng 333 triệu đồng; từ mức này, phần theo điểm a không tăng thêm do mức trần 100 triệu đồng một đề tài. Vì hai điểm áp dụng cho hai phạm vi khác nhau, khác biệt này tự nó chưa cho thấy xung đột giữa hai quy định mà thể hiện tác động của mức trần đối với đề tài sử dụng ngân sách nhà nước.</w:t>
       </w:r>
     </w:p>
     <w:p>
@@ -16502,7 +16515,7 @@
         <w:rPr>
           <w:szCs w:val="26"/>
         </w:rPr>
-        <w:t>Thứ ba, năng lực nghiên cứu tăng nhanh: số bài báo tăng bình quân 62,7% một năm, đạt 1,11 bài trên một giảng viên năm 2025; 6 trên 9 chỉ tiêu khoa học công nghệ xác định được của Kế hoạch 07/KH-ĐHTĐ đạt hoặc vượt; ba đề tài cấp quốc gia với tổng kinh phí 4,67 tỷ đồng được phê duyệt.</w:t>
+        <w:t>Thứ ba, năng lực nghiên cứu tăng nhanh: số bài báo tăng bình quân 62,7% một năm, tương đương 1,11 bài năm 2025 trên một giảng viên nếu tính theo danh sách giảng viên năm 2026; 6 trên 9 chỉ tiêu khoa học công nghệ xác định được của Kế hoạch 07/KH-ĐHTĐ đạt hoặc vượt; ba đề tài cấp quốc gia với tổng kinh phí 4,67 tỷ đồng được phê duyệt.</w:t>
       </w:r>
     </w:p>
     <w:p>
@@ -16767,7 +16780,7 @@
         <w:rPr>
           <w:szCs w:val="26"/>
         </w:rPr>
-        <w:t>Về quy trình, đây là khoảng trống kỹ thuật cốt lõi: thiếu một biểu mẫu rà soát tại thời điểm nghiệm thu. Biểu mẫu hiện hành ghi nhận tình trạng đăng ký nhưng chưa yêu cầu sàng lọc khả năng bảo hộ và tình trạng bộc lộ, nên việc khởi động thủ tục phụ thuộc nhiều vào sự chủ động của chủ nhiệm đề tài khi nộp hồ sơ tại Phòng Khoa học Công nghệ theo Điều 35 Quyết định 213; mức độ thực hiện nhiệm vụ nhận diện của Phòng theo Điều 11 Quyết định 217 chưa được đánh giá.</w:t>
+        <w:t>Về quy trình, trong hồ sơ được tiếp cận chưa thấy biểu mẫu rà soát khả năng bảo hộ tại thời điểm nghiệm thu, và đây có thể là một yếu tố cản trở. Biểu mẫu hiện hành ghi nhận tình trạng đăng ký nhưng chưa yêu cầu sàng lọc khả năng bảo hộ và tình trạng bộc lộ, nên việc khởi động thủ tục phụ thuộc nhiều vào sự chủ động của chủ nhiệm đề tài khi nộp hồ sơ tại Phòng Khoa học Công nghệ theo Điều 35 Quyết định 213; mức độ thực hiện nhiệm vụ nhận diện của Phòng theo Điều 11 Quyết định 217 chưa được đánh giá.</w:t>
       </w:r>
     </w:p>
     <w:p>
@@ -16845,7 +16858,7 @@
         <w:rPr>
           <w:szCs w:val="26"/>
         </w:rPr>
-        <w:t>Về con người, lực lượng nghiên cứu nòng cốt còn mỏng so với quy mô và chưa được bồi dưỡng chuyên sâu về nhận diện, bảo hộ tài sản trí tuệ.</w:t>
+        <w:t>Về con người, phân tích thăm dò trên danh sách nhân sự năm 2026 cho thấy hoạt động công bố tập trung ở một nhóm tương đối nhỏ; hồ sơ chưa ghi nhận chương trình bồi dưỡng chuyên sâu về nhận diện, bảo hộ tài sản trí tuệ.</w:t>
       </w:r>
     </w:p>
     <w:p>
@@ -16982,7 +16995,7 @@
         <w:rPr>
           <w:szCs w:val="26"/>
         </w:rPr>
-        <w:t>Về khách quan, pháp luật thay đổi dồn dập trong giai đoạn 2025 - 2026 tạo ra độ trễ thể chế đối với các quy chế ban hành trước đó, làm phát sinh nhu cầu rà soát phạm vi áp dụng từ cuối năm 2025. Về chủ quan, Đề tài nhận định khoảng trống kỹ thuật cốt lõi là thiếu một biểu mẫu rà soát tại thời điểm nghiệm thu, cùng với việc chưa có dự toán riêng cho bước đăng ký, chưa thống nhất cách hiểu và thứ tự áp dụng các quy định về lợi ích của tác giả, và chưa có dữ liệu liên thông; các nhận định này cần được kiểm chứng trong quá trình triển khai. Đây là căn cứ để Chương 3 đề xuất hệ thống giải pháp, trong đó bước sàng lọc tại nghiệm thu và trước khi công bố, cùng việc hoàn thiện quy chế theo phạm vi áp dụng của luật mới, là hai điểm ưu tiên.</w:t>
+        <w:t>Về khách quan, pháp luật thay đổi dồn dập trong giai đoạn 2025 - 2026 tạo ra độ trễ thể chế đối với các quy chế ban hành trước đó, làm phát sinh nhu cầu rà soát phạm vi áp dụng từ cuối năm 2025. Về chủ quan, Đề tài nêu giả thuyết rằng một số yếu tố có thể đang cản trở việc chuyển kết quả thành đơn: trong hồ sơ được tiếp cận chưa thấy biểu mẫu rà soát khả năng bảo hộ tại thời điểm nghiệm thu và chưa thấy dự toán riêng cho bước đăng ký; cách hiểu và thứ tự áp dụng các quy định về lợi ích của tác giả chưa được thống nhất; dữ liệu chưa liên thông. Hồ sơ hiện có chưa đủ để xác định yếu tố nào là nguyên nhân chính; các giả thuyết này cần được kiểm chứng trong quá trình triển khai. Đây là căn cứ để Chương 3 đề xuất hệ thống giải pháp, trong đó bước sàng lọc tại nghiệm thu và trước khi công bố, cùng việc hoàn thiện quy chế theo phạm vi áp dụng của luật mới, là hai điểm ưu tiên.</w:t>
       </w:r>
     </w:p>
     <w:p>
@@ -17141,7 +17154,7 @@
         <w:rPr>
           <w:szCs w:val="26"/>
         </w:rPr>
-        <w:t xml:space="preserve"> Luật Khoa học, công nghệ và đổi mới sáng tạo số 93/2025/QH15 có hiệu lực thi hành từ ngày 01 tháng 10 năm 2025 điều chỉnh hai cơ chế lợi ích của tác giả. Một là, tại điểm b và điểm h khoản 7 Điều 71, Luật sửa khoản 1 Điều 135 Luật Sở hữu trí tuệ: chủ sở hữu trả thù lao cho tác giả sáng chế, kiểu dáng công nghiệp, thiết kế bố trí theo thỏa thuận; nếu không có thỏa thuận thì mức thù lao là 10% lợi nhuận trước thuế khi chủ sở hữu tự sử dụng, hoặc 15% tổng số tiền nhận được mỗi lần trước thuế khi chuyển giao quyền sử dụng; khoản 2 Điều 135 bị bãi bỏ. Hai là, Điều 28 quy định phân chia lợi nhuận từ thương mại hóa theo nguồn hình thành: chủ sở hữu tự quyết định đối với phần không sử dụng ngân sách nhà nước; đối với phần sử dụng ngân sách nhà nước, tổ chức chủ trì dùng lợi nhuận sau thuế để thưởng cho tác giả tối thiểu 30%, thưởng cho người tổ chức thương mại hóa, tái đầu tư và mục đích khác, và tác giả sáng chế, kiểu dáng công nghiệp, thiết kế bố trí còn hưởng quyền lợi theo Luật Sở hữu trí tuệ; khoản 3 và khoản 7 Điều 73 quy định chuyển tiếp theo thời điểm giao nhiệm vụ. Bên cạnh đó, khoản 2 Điều 25 quy định tổ chức chủ trì nhiệm vụ sử dụng ngân sách nhà nước được Nhà nước tự động giao quyền quản lý, sử dụng, quyền sở hữu phần kết quả tương ứng, không phải bồi hoàn chi phí; Điều 27 cho phép tổ chức được giao quyền tự quyết định hình thức, giá và phân chia lợi nhuận khi thương mại hóa; điểm b khoản 2 Điều 66 cho phép quỹ phát triển khoa học và công nghệ của tổ chức chi cho đăng ký, bảo hộ, quản lý, khai thác quyền sở hữu trí tuệ. Các quy định này là căn cứ để rà soát điểm a khoản 4 Điều 36 Quyết định số 213/QĐ-ĐHTĐ, gồm mức trần 100 triệu đồng, khoản nộp ngân sách nhà nước và cơ sở tính, đối với các trường hợp thuộc phạm vi áp dụng của Luật mới, như phân tích tại Mục 2.2.1.</w:t>
+        <w:t xml:space="preserve"> Luật Khoa học, công nghệ và đổi mới sáng tạo số 93/2025/QH15 có hiệu lực thi hành từ ngày 01 tháng 10 năm 2025 điều chỉnh hai cơ chế lợi ích của tác giả. Một là, tại điểm b và điểm h khoản 7 Điều 71, Luật sửa khoản 1 Điều 135 Luật Sở hữu trí tuệ: chủ sở hữu trả thù lao cho tác giả sáng chế, kiểu dáng công nghiệp, thiết kế bố trí theo thỏa thuận; nếu không có thỏa thuận thì mức thù lao là 10% lợi nhuận trước thuế khi chủ sở hữu tự sử dụng, hoặc 15% tổng số tiền nhận được mỗi lần trước thuế khi chuyển giao quyền sử dụng; khoản 2 Điều 135 bị bãi bỏ. Hai là, Điều 28 quy định phân chia lợi nhuận từ thương mại hóa theo nguồn hình thành: chủ sở hữu tự quyết định đối với phần không sử dụng ngân sách nhà nước; đối với phần sử dụng ngân sách nhà nước, tổ chức chủ trì dùng lợi nhuận sau thuế để thưởng cho tác giả tối thiểu 30%, thưởng cho người tổ chức thương mại hóa, tái đầu tư và mục đích khác, và tác giả sáng chế, kiểu dáng công nghiệp, thiết kế bố trí còn hưởng quyền lợi theo Luật Sở hữu trí tuệ; khoản 3 và khoản 7 Điều 73 quy định chuyển tiếp theo thời điểm giao nhiệm vụ. Bên cạnh đó, khoản 2 Điều 25 quy định tổ chức chủ trì nhiệm vụ sử dụng ngân sách nhà nước được Nhà nước tự động giao quyền quản lý, sử dụng, quyền sở hữu phần kết quả tương ứng, không phải bồi hoàn chi phí; Điều 27 cho phép tổ chức được giao quyền tự quyết định hình thức, giá và phân chia lợi nhuận khi thương mại hóa; điểm b khoản 2 Điều 66 cho phép quỹ phát triển khoa học và công nghệ của tổ chức chi cho đăng ký, bảo hộ, quản lý, khai thác quyền sở hữu trí tuệ. Các quy định này là căn cứ để rà soát điểm a khoản 4 Điều 36 Quyết định số 213/QĐ-ĐHTĐ, gồm mức trần 100 triệu đồng, khoản nộp ngân sách nhà nước và cơ sở tính, đối với các trường hợp thuộc phạm vi áp dụng của Luật mới, như phân tích tại Mục 2.2.1. Nghị định số 267/2025/NĐ-CP, có hiệu lực từ ngày 14 tháng 10 năm 2025, quy định chi tiết các nội dung này: khoản 2 Điều 32 giao tự động quyền sở hữu phần kết quả tương ứng với kinh phí ngân sách nhà nước cho tổ chức chủ trì không phải là đơn vị công lập, như Nhà trường, và yêu cầu theo dõi riêng thông tin về kết quả; Điều 34 yêu cầu phân chia lợi nhuận công khai, minh bạch, quy định tổ chức trung gian, môi giới hưởng tối thiểu 10% lợi nhuận khi các bên không có thỏa thuận khác, và phần thưởng giữa các đồng tác giả được chia theo thỏa thuận của họ.</w:t>
       </w:r>
     </w:p>
     <w:p>
@@ -17866,7 +17879,7 @@
               <w:rPr>
                 <w:sz w:val="24"/>
               </w:rPr>
-              <w:t xml:space="preserve"> ngưỡng công bố WoS, Scopus là 0,3 trên một giảng viên quy đổi, ước tính năm 2025 của Nhà trường khoảng 0,31 và văn bằng không được tính; nguy cơ công bố trước khi nộp đơn làm mất tính mới sau mười hai tháng.</w:t>
+              <w:t xml:space="preserve"> ngưỡng công bố WoS, Scopus là 0,3 trên một giảng viên quy đổi; nếu tính trên danh sách giảng viên năm 2026, chỉ số năm 2025 của Nhà trường ước khoảng 0,31, sát ngưỡng, và văn bằng không được tính; nguy cơ công bố trước khi nộp đơn làm mất tính mới sau mười hai tháng.</w:t>
             </w:r>
           </w:p>
           <w:p>
@@ -17900,13 +17913,13 @@
                 <w:b/>
                 <w:sz w:val="24"/>
               </w:rPr>
-              <w:t xml:space="preserve">4. Pháp luật thay đổi nhanh, hướng dẫn chưa đồng bộ:</w:t>
-            </w:r>
-            <w:r>
-              <w:rPr>
-                <w:sz w:val="24"/>
-              </w:rPr>
-              <w:t xml:space="preserve"> sáu văn bản lớn trong giai đoạn 2025 - 2026; bảng tổng hợp cuối Phụ lục II Thông tư số 83/2026/TT-BGDĐT chưa nêu giải pháp hữu ích dù công thức đã tính.</w:t>
+              <w:t xml:space="preserve">4. Pháp luật thay đổi nhanh, cần đối chiếu liên văn bản:</w:t>
+            </w:r>
+            <w:r>
+              <w:rPr>
+                <w:sz w:val="24"/>
+              </w:rPr>
+              <w:t xml:space="preserve"> nhiều luật, nghị định, thông tư mới được ban hành trong giai đoạn 2025 - 2026, trong đó Nghị định số 267/2025/NĐ-CP đã quy định chi tiết việc giao quyền, thương mại hóa và phân chia lợi nhuận; quy chế nội bộ phải được đối chiếu đồng thời với các văn bản này. Bảng tổng hợp cuối Phụ lục II Thông tư số 83/2026/TT-BGDĐT chưa nêu giải pháp hữu ích dù công thức đã tính.</w:t>
             </w:r>
           </w:p>
           <w:p>
@@ -18290,7 +18303,7 @@
               <w:rPr>
                 <w:sz w:val="24"/>
               </w:rPr>
-              <w:t xml:space="preserve">Lập danh mục số tài sản trí tuệ liên thông với báo cáo trên HEMIS và Nền tảng số quốc gia; lập dự toán phí xác lập quyền và giao đầu mối; đào tạo giảng viên về bộc lộ an toàn trước khi công bố.</w:t>
+              <w:t xml:space="preserve">Lập danh mục số tài sản trí tuệ để quản lý nội bộ, có phân quyền truy cập, và trích dữ liệu được phép công bố cho báo cáo trên HEMIS, Nền tảng số quốc gia; lập dự toán phí xác lập quyền và giao đầu mối; đào tạo giảng viên về bộc lộ an toàn trước khi công bố.</w:t>
             </w:r>
           </w:p>
         </w:tc>
@@ -18372,7 +18385,7 @@
         <w:rPr>
           <w:szCs w:val="26"/>
         </w:rPr>
-        <w:t xml:space="preserve">Dữ liệu thực trạng tại Chương 2 cho thấy điểm nghẽn nằm ở khâu nối giữa nghiệm thu và đăng ký: 9 trên 38 đề tài có sản phẩm tiềm năng sở hữu công nghiệp nhưng chỉ 1 đề tài có đơn, trong khi năng lực công bố tập trung ở một nhóm nhỏ với hệ số Gini 0,832. Điểm nghẽn này liên quan đồng thời đến quy chế, quy trình, cơ chế tài chính, năng lực đầu mối và dữ liệu. Kết hợp với phân tích tại Mục 3.1.2, hệ thống giải pháp được xây dựng dựa trên năm nguyên tắc chỉ đạo:</w:t>
+        <w:t xml:space="preserve">Dữ liệu thực trạng tại Chương 2 gợi ý điểm nghẽn nằm ở khâu nối giữa kết quả nghiên cứu và đăng ký: 9 trên 38 đề tài có sản phẩm tiềm năng sở hữu công nghiệp nhưng chỉ 1 đề tài có đơn, trong khi phân tích thăm dò trên danh sách nhân sự năm 2026 cho thấy hoạt động công bố tập trung ở một nhóm tương đối nhỏ. Điểm nghẽn này có thể liên quan đồng thời đến quy chế, quy trình, cơ chế tài chính, năng lực đầu mối và dữ liệu; mức độ tác động của từng yếu tố cần được kiểm chứng trong quá trình triển khai. Kết hợp với phân tích tại Mục 3.1.2, hệ thống giải pháp được xây dựng dựa trên năm nguyên tắc chỉ đạo:</w:t>
       </w:r>
     </w:p>
     <w:p>
@@ -18550,7 +18563,7 @@
         <w:rPr>
           <w:szCs w:val="26"/>
         </w:rPr>
-        <w:t xml:space="preserve">Kết quả phân tích tại Chương 2 cho thấy các quy định nội bộ liên quan đến lợi ích của tác giả nằm ở bốn văn bản, gồm Quyết định số 213/QĐ-ĐHTĐ, Quyết định số 217/QĐ-ĐHTĐ ngày 21 tháng 11 năm 2024 ban hành Quy chế quản trị tài sản trí tuệ, Quy chế chi tiêu nội bộ và Điều lệ Quỹ Học bổng sau tiến sĩ Ngô Xuân Độ, được ban hành ở những thời điểm và cho những kênh tài trợ khác nhau. Các quy định này chưa xung đột trong cùng một tình huống, nhưng chưa làm rõ phạm vi và thứ tự áp dụng, chưa phân biệt thưởng, thù lao, nhuận bút và phần chia nguồn thu, và điểm a khoản 4 Điều 36 Quyết định 213 cần được rà soát theo Điều 28, Điều 73 Luật số 93/2025/QH15 đối với các trường hợp thuộc phạm vi của Luật mới; đây là hạn chế thứ hai tại Mục 2.5.2. Quyết định 217 đã mở rộng phạm vi tài sản, quy định công bố, bảo mật, phân công trách nhiệm và hành vi xâm phạm quyền tác giả tại Điều 14, nhưng không dẫn chiếu Chương VI Quyết định 213; Thông tư số 83/2026/TT-BGDĐT xếp liêm chính khoa học, liêm chính học thuật cùng nhóm nội dung quản trị bắt buộc về sở hữu trí tuệ.</w:t>
+        <w:t xml:space="preserve">Kết quả phân tích tại Chương 2 cho thấy các quy định nội bộ liên quan đến lợi ích của tác giả nằm ở bốn văn bản, gồm Quyết định số 213/QĐ-ĐHTĐ, Quyết định số 217/QĐ-ĐHTĐ ngày 21 tháng 11 năm 2024 ban hành Quy chế quản trị tài sản trí tuệ, Quy chế chi tiêu nội bộ và Điều lệ Quỹ Học bổng sau tiến sĩ Ngô Xuân Độ, được ban hành ở những thời điểm và cho những kênh tài trợ khác nhau. Qua đối chiếu theo từng tình huống, Đề tài chưa xác định được trường hợp các quy định này áp dụng không tương thích cho cùng một tài sản; tuy vậy, các quy định chưa làm rõ phạm vi và thứ tự áp dụng, chưa phân biệt thưởng, thù lao, nhuận bút và phần chia nguồn thu, và điểm a khoản 4 Điều 36 Quyết định 213 cần được rà soát theo Điều 28, Điều 73 Luật số 93/2025/QH15 và Điều 34 Nghị định số 267/2025/NĐ-CP đối với các trường hợp thuộc phạm vi của Luật mới; đây là hạn chế thứ hai tại Mục 2.5.2. Quyết định 217 đã mở rộng phạm vi tài sản, quy định công bố, bảo mật, phân công trách nhiệm và hành vi xâm phạm quyền tác giả tại Điều 14, nhưng không dẫn chiếu Chương VI Quyết định 213; Thông tư số 83/2026/TT-BGDĐT xếp liêm chính khoa học, liêm chính học thuật cùng nhóm nội dung quản trị bắt buộc về sở hữu trí tuệ.</w:t>
       </w:r>
     </w:p>
     <w:p>
@@ -18644,7 +18657,7 @@
         <w:rPr>
           <w:szCs w:val="26"/>
         </w:rPr>
-        <w:t xml:space="preserve"> Thiết kế theo ba lớp, xác định theo nguồn hình thành tài sản, thời điểm giao nhiệm vụ và loại đối tượng. Lớp thứ nhất là nghĩa vụ theo luật: đối với phần kết quả sử dụng ngân sách nhà nước thuộc phạm vi Điều 28 Luật số 93/2025/QH15, gồm nhiệm vụ giao từ ngày 01 tháng 10 năm 2025 và trường hợp tại khoản 7 Điều 73, thưởng cho tác giả không thấp hơn 30% lợi nhuận sau thuế hoặc 30% giá trị kết quả khi góp vốn, không áp mức trần làm phần thưởng thấp hơn mức này và không giữ khoản nộp ngân sách nhà nước như một tỷ lệ cố định; đối với nhiệm vụ phê duyệt trước ngày 01 tháng 10 năm 2025 không thuộc khoản 7 Điều 73, áp dụng văn bản có hiệu lực tại thời điểm phê duyệt; đối với sáng chế, kiểu dáng công nghiệp, thiết kế bố trí, quy định thù lao theo Điều 135 Luật Sở hữu trí tuệ như một khoản riêng và xác định rõ quy chế hoặc hợp đồng có phải là thỏa thuận về thù lao hay không. Lớp thứ hai là phần do Nhà trường tự quyết đối với tài sản không sử dụng ngân sách nhà nước theo khoản 2 Điều 28: tỷ lệ thưởng cho tác giả, phần cho đơn vị có tác giả và quỹ phát triển khoa học công nghệ, quan hệ với quy định trích 50% kinh phí chuyển giao công nghệ tại Quy chế chi tiêu nội bộ. Lớp thứ ba là nhuận bút cho sách, giáo trình theo Quy chế chi tiêu nội bộ, giữ nguyên khoản 2 Điều 13 Quyết định 217. Các phương án tỷ lệ cụ thể cho lớp thứ hai, như dành tỷ lệ cao hơn cho tác giả trong năm đầu phát sinh doanh thu, chỉ là phương án tham khảo và cần được mô phỏng trên một số tình huống chuyển giao trước khi đưa vào quy chế; Quy chế không áp một công thức chung cho mọi tài sản và mọi nguồn kinh phí.</w:t>
+        <w:t xml:space="preserve"> Thiết kế theo ba lớp, xác định theo nguồn hình thành tài sản, thời điểm giao nhiệm vụ và loại đối tượng. Lớp thứ nhất là nghĩa vụ theo luật: đối với phần kết quả sử dụng ngân sách nhà nước thuộc phạm vi Điều 28 Luật số 93/2025/QH15, gồm nhiệm vụ giao từ ngày 01 tháng 10 năm 2025 và trường hợp tại khoản 7 Điều 73, thưởng cho tác giả không thấp hơn 30% lợi nhuận sau thuế hoặc 30% giá trị kết quả khi góp vốn, không áp mức trần làm phần thưởng thấp hơn mức này và không giữ khoản nộp ngân sách nhà nước như một tỷ lệ cố định; đối với nhiệm vụ phê duyệt trước ngày 01 tháng 10 năm 2025 không thuộc khoản 7 Điều 73, áp dụng văn bản có hiệu lực tại thời điểm phê duyệt; đối với sáng chế, kiểu dáng công nghiệp, thiết kế bố trí, quy định thù lao theo Điều 135 Luật Sở hữu trí tuệ như một khoản riêng và xác định rõ quy chế hoặc hợp đồng có phải là thỏa thuận về thù lao hay không. Lớp thứ hai là phần do Nhà trường tự quyết đối với tài sản không sử dụng ngân sách nhà nước theo khoản 2 Điều 28: tỷ lệ thưởng cho tác giả, phần cho đơn vị có tác giả và quỹ phát triển khoa học công nghệ, quan hệ với quy định trích 50% kinh phí chuyển giao công nghệ tại Quy chế chi tiêu nội bộ. Lớp thứ ba là nhuận bút cho sách, giáo trình theo Quy chế chi tiêu nội bộ, giữ nguyên khoản 2 Điều 13 Quyết định 217. Các phương án tỷ lệ cụ thể cho lớp thứ hai, như dành tỷ lệ cao hơn cho tác giả trong năm đầu phát sinh doanh thu, chỉ là phương án tham khảo và cần được mô phỏng trên một số tình huống chuyển giao trước khi đưa vào quy chế; Quy chế không áp một công thức chung cho mọi tài sản và mọi nguồn kinh phí. Quy chế cần kèm mẫu thỏa thuận phân chia phần thưởng giữa các đồng tác giả, vì theo khoản 5 Điều 28 Luật số 93/2025/QH15 và khoản 3 Điều 34 Nghị định số 267/2025/NĐ-CP, phần thưởng là mức dành chung cho các đồng tác giả và được chia theo thỏa thuận giữa họ; mẫu này dùng chung với văn bản xác định mức độ đóng góp lập tại Khâu 5 của Giải pháp 3.</w:t>
       </w:r>
     </w:p>
     <w:p>
@@ -19067,7 +19080,7 @@
         <w:rPr>
           <w:szCs w:val="26"/>
         </w:rPr>
-        <w:t xml:space="preserve">Thực trạng tại Chương 2 cho thấy 9 đề tài có sản phẩm tiềm năng sở hữu công nghiệp nhưng mới 1 đề tài có đơn, ứng với hạn chế thứ nhất và thứ bảy tại Mục 2.5.2, và Đề tài nhận định khoảng trống kỹ thuật: thiếu một biểu mẫu rà soát tại thời điểm nghiệm thu. Các biểu mẫu tại Quyết định 213 đã có mục về đăng ký sở hữu trí tuệ nhưng chưa có nội dung sàng lọc khả năng bảo hộ và tình trạng bộc lộ; danh mục tài sản trí tuệ chưa liên kết với danh mục đề tài. Giải pháp này nhằm hoàn thiện biểu mẫu hiện có và chuẩn hóa quy trình để mỗi kết quả có tiềm năng được khai báo, sàng lọc và xem xét bảo mật trước khi công bố hoặc trình diễn, với cách xử lý phù hợp từng loại đối tượng.</w:t>
+        <w:t xml:space="preserve">Thực trạng tại Chương 2 cho thấy 9 đề tài có sản phẩm tiềm năng sở hữu công nghiệp nhưng mới 1 đề tài có đơn, ứng với hạn chế thứ nhất và thứ bảy tại Mục 2.5.2, và Đề tài nêu giả thuyết rằng việc thiếu bước sàng lọc trước khi công bố và tại nghiệm thu có thể là một yếu tố cản trở. Các biểu mẫu tại Quyết định 213 đã có mục về đăng ký sở hữu trí tuệ nhưng chưa có nội dung sàng lọc khả năng bảo hộ và tình trạng bộc lộ; danh mục tài sản trí tuệ chưa liên kết với danh mục đề tài. Giải pháp này nhằm hoàn thiện biểu mẫu hiện có và chuẩn hóa quy trình để mỗi kết quả có tiềm năng được khai báo, sàng lọc và xem xét bảo mật trước khi công bố hoặc trình diễn, với cách xử lý phù hợp từng loại đối tượng. Kết quả cần được bảo vệ trước khi công bố phải được quyết định đăng ký và cấp kinh phí ngay trong quá trình nghiên cứu, không chờ đến nghiệm thu.</w:t>
       </w:r>
     </w:p>
     <w:p>
@@ -19096,7 +19109,7 @@
         <w:rPr>
           <w:szCs w:val="26"/>
         </w:rPr>
-        <w:t xml:space="preserve">Ban hành Quy trình chuẩn 8 khâu quản lý tài sản trí tuệ từ khai báo đến khai thác, áp dụng cho tất cả các đề tài cấp cơ sở và các nhiệm vụ khoa học công nghệ sử dụng ngân sách, được tóm tắt tại hình dưới đây và mô tả cụ thể sau đó.</w:t>
+        <w:t xml:space="preserve">Ban hành Quy trình chuẩn 8 khâu quản lý tài sản trí tuệ từ khai báo đến khai thác, áp dụng cho tất cả các đề tài cấp cơ sở và các nhiệm vụ khoa học công nghệ sử dụng ngân sách, được tóm tắt tại hình dưới đây và mô tả cụ thể sau đó. Quy trình có hai luồng. Luồng sớm áp dụng cho kết quả đã được sàng lọc và đánh giá tại Khâu 2, Khâu 3 và cần nộp đơn trước khi công bố hoặc trình diễn: hồ sơ được chuyển thẳng sang Khâu 6 để quyết định đăng ký, cấp kinh phí và nộp đơn, kể cả khi đề tài đang thực hiện. Luồng thường áp dụng cho các kết quả còn lại và đi qua Khâu 5. Nghiệm thu là bước kiểm tra, cập nhật tình trạng quyền, không phải điều kiện để quyết định đăng ký. Cách làm này phù hợp Điều 35 Quyết định 213, vốn không đặt điều kiện đã nghiệm thu đối với việc tác giả nộp đơn tại Phòng Khoa học Công nghệ.</w:t>
       </w:r>
     </w:p>
     <w:p>
@@ -19115,7 +19128,7 @@
           <w:b/>
           <w:szCs w:val="26"/>
         </w:rPr>
-        <w:t>Hình 3.2. Quy trình 8 khâu quản lý tài sản trí tuệ từ khai báo đến khai thác, kèm phân nhánh theo loại đối tượng</w:t>
+        <w:t>Hình 3.2. Quy trình 8 khâu quản lý tài sản trí tuệ từ khai báo đến khai thác, kèm luồng nộp đơn sớm và phân nhánh theo loại đối tượng</w:t>
       </w:r>
     </w:p>
     <w:p>
@@ -19256,7 +19269,7 @@
         <w:rPr>
           <w:szCs w:val="26"/>
         </w:rPr>
-        <w:t xml:space="preserve"> Xem xét bảo mật trước khi công bố hoặc trình diễn. Trước khi gửi bài báo, báo cáo hội thảo, luận văn hoặc đưa sản phẩm vào thử nghiệm mở, trình diễn tại Không gian sáng tạo mở thử nghiệm, chủ nhiệm đề tài xin ý kiến Phòng Khoa học Công nghệ theo Điều 10 Quyết định 217; Phòng thông báo công bố, trì hoãn công bố hoặc yêu cầu nộp đơn trước theo Điều 11, hoặc yêu cầu người tham gia ký cam kết bảo mật. Khi kết quả đã bị bộc lộ, Phòng xác định ngày bộc lộ để tính thời hạn mười hai tháng theo khoản 3 Điều 60 Luật Sở hữu trí tuệ. Cách làm này phù hợp với định hướng đăng ký bảo hộ đồng thời với công bố tại điểm b khoản 4 Mục III Điều 1 Quyết định số 1068/QĐ-TTg đã được sửa đổi.</w:t>
+        <w:t xml:space="preserve"> Xem xét bảo mật trước khi công bố hoặc trình diễn. Trước khi gửi bài báo, báo cáo hội thảo, luận văn hoặc đưa sản phẩm vào thử nghiệm mở, trình diễn tại Không gian sáng tạo mở thử nghiệm, chủ nhiệm đề tài xin ý kiến Phòng Khoa học Công nghệ theo Điều 10 Quyết định 217; Phòng thông báo công bố, trì hoãn công bố hoặc yêu cầu nộp đơn trước theo Điều 11, hoặc yêu cầu người tham gia ký cam kết bảo mật. Khi yêu cầu nộp đơn trước, Phòng chuyển hồ sơ đã có kết quả đánh giá tại Khâu 3 sang Khâu 6 theo luồng sớm, và việc công bố chỉ được thực hiện sau khi đã có ngày nộp đơn. Khi kết quả đã bị bộc lộ, Phòng xác định ngày bộc lộ để tính thời hạn mười hai tháng theo khoản 3 Điều 60 Luật Sở hữu trí tuệ. Cách làm này phù hợp với định hướng đăng ký bảo hộ đồng thời với công bố tại điểm b khoản 4 Mục III Điều 1 Quyết định số 1068/QĐ-TTg đã được sửa đổi.</w:t>
       </w:r>
     </w:p>
     <w:p>
@@ -19276,7 +19289,7 @@
         <w:rPr>
           <w:szCs w:val="26"/>
         </w:rPr>
-        <w:t xml:space="preserve"> Xác nhận tại nghiệm thu. Mẫu 16 phiếu nghiệm thu được bổ sung phiếu rà soát gồm các trường: loại đối tượng, chủ thể quyền, nguồn kinh phí và thời điểm giao nhiệm vụ, tình trạng bộc lộ và ngày bộc lộ nếu có, kết quả sàng lọc tại Khâu 2 và Khâu 3, đề xuất hướng xử lý. Hội đồng nghiệm thu xác nhận phiếu rà soát; kết quả được đề xuất đăng ký được chuyển sang Khâu 6 trong thời hạn quy định.</w:t>
+        <w:t xml:space="preserve"> Kiểm tra tại nghiệm thu. Mẫu 16 phiếu nghiệm thu được bổ sung phiếu rà soát gồm các trường: loại đối tượng, chủ thể quyền, nguồn kinh phí và thời điểm giao nhiệm vụ, tình trạng bộc lộ và ngày bộc lộ nếu có, kết quả sàng lọc tại Khâu 2 và Khâu 3, tình trạng quyền của các kết quả đã đi theo luồng sớm như đã nộp đơn, đã có số đơn, đã chấp nhận đơn hợp lệ, và đề xuất hướng xử lý. Nghiệm thu không phải điều kiện để quyết định đăng ký hay cấp kinh phí: Hội đồng nghiệm thu kiểm tra việc khai báo đã đầy đủ chưa, phát hiện kết quả chưa được khai báo, xác nhận tình trạng quyền và mức độ đóng góp của các thành viên. Đối với nhiệm vụ sử dụng ngân sách nhà nước, hồ sơ đánh giá cuối kỳ có văn bản xác định mức độ đóng góp của thành viên, có xác nhận của các thành viên, để làm căn cứ phân chia lợi nhuận theo điểm g khoản 2 Điều 17 Nghị định số 267/2025/NĐ-CP; đề tài cấp cơ sở áp dụng cùng cách làm. Kết quả chưa được xử lý trong quá trình nghiên cứu và được đề xuất đăng ký được chuyển sang Khâu 6 theo luồng thường.</w:t>
       </w:r>
     </w:p>
     <w:p>
@@ -19296,7 +19309,7 @@
         <w:rPr>
           <w:szCs w:val="26"/>
         </w:rPr>
-        <w:t xml:space="preserve"> Quyết định xác lập quyền và dự toán. Trên cơ sở phiếu rà soát, Phòng Khoa học Công nghệ trình Hiệu trưởng quyết định đăng ký theo Điều 35 Quyết định 213, kèm dự toán phí nộp đơn, phí đại diện, phí duy trì, nguồn chi, người đề xuất chi và thời hạn nộp đơn; Phòng Tài chính - Kế toán bố trí tạm ứng theo Giải pháp 4. Thời hạn từ khi có phiếu rà soát đến khi có quyết định không quá 15 ngày làm việc.</w:t>
+        <w:t xml:space="preserve"> Quyết định xác lập quyền và cấp kinh phí. Khâu này nhận hồ sơ từ hai luồng: luồng sớm, gồm kết quả đã được đánh giá khả năng bảo hộ tại Khâu 3 và cần nộp đơn trước khi công bố, trình diễn, kể cả khi đề tài đang thực hiện; luồng thường, gồm kết quả được đề xuất tại Khâu 5. Phòng Khoa học Công nghệ trình Hiệu trưởng quyết định đăng ký theo Điều 35 Quyết định 213, kèm dự toán phí nộp đơn, phí đại diện, phí duy trì, nguồn chi, người đề xuất chi và thời hạn nộp đơn; Phòng Tài chính - Kế toán bố trí tạm ứng theo Giải pháp 4. Thời hạn từ khi có kết quả đánh giá tại Khâu 3 đối với luồng sớm, hoặc từ khi có phiếu rà soát đối với luồng thường, đến khi có quyết định không quá 15 ngày làm việc; với luồng sớm, quyết định phải được ban hành và đơn phải được nộp trước ngày công bố dự kiến.</w:t>
       </w:r>
     </w:p>
     <w:p>
@@ -19394,7 +19407,7 @@
         <w:rPr>
           <w:szCs w:val="26"/>
         </w:rPr>
-        <w:t xml:space="preserve">Phiếu khai báo và phiếu rà soát được ban hành kèm quy trình; tài khoản truy cập công cụ tra cứu sáng chế; danh mục số tài sản trí tuệ dùng chung giữa Phòng Khoa học Công nghệ, Bộ phận Pháp chế và bộ phận quản trị thương hiệu; nhân sự đầu mối theo Giải pháp 2.</w:t>
+        <w:t xml:space="preserve">Phiếu khai báo và phiếu rà soát được ban hành kèm quy trình; tài khoản truy cập công cụ tra cứu sáng chế; danh mục số tài sản trí tuệ dùng chung giữa Phòng Khoa học Công nghệ, Bộ phận Pháp chế và bộ phận quản trị thương hiệu, có phân quyền truy cập: hồ sơ chưa nộp đơn, bí mật kinh doanh và thông tin bị ràng buộc bởi hợp đồng chỉ người được giao xử lý mới truy cập được; danh mục theo dõi riêng kết quả hình thành từ ngân sách nhà nước theo khoản 2 Điều 32 Nghị định số 267/2025/NĐ-CP; nhân sự đầu mối theo Giải pháp 2.</w:t>
       </w:r>
     </w:p>
     <w:p>
@@ -19441,7 +19454,7 @@
         <w:rPr>
           <w:szCs w:val="26"/>
         </w:rPr>
-        <w:t xml:space="preserve">Chương 2 cho thấy quy chế đã có căn cứ chi cho bước xác lập quyền tại Điều 35, Điều 38 Quyết định 213 và Điều 13 Quyết định 217, nhưng chưa thấy dự toán riêng, cách tạm ứng, thanh toán khi đơn được nộp sau nghiệm thu, thời hạn và người chịu trách nhiệm đề xuất chi; số liệu chi thực tế chưa được thống kê. Quy chế chi tiêu nội bộ năm 2026 ghi nhận văn bằng khi được cấp và chưa có tiền thưởng cho văn bằng, trong khi bài báo quốc tế được thưởng ngay khi đăng; hoạt động khai thác có thu phí còn nhỏ, ứng với hạn chế thứ sáu tại Mục 2.5.2. Giải pháp này nhằm chuyển căn cứ chi hiện có thành một dòng dự toán vận hành được, điều chỉnh thời điểm ghi nhận văn bằng và chuẩn bị phương án tổ chức khai thác theo giai đoạn.</w:t>
+        <w:t xml:space="preserve">Chương 2 cho thấy quy chế đã có căn cứ chi cho bước xác lập quyền tại Điều 35, Điều 38 Quyết định 213 và Điều 13 Quyết định 217, nhưng chưa thấy dự toán riêng, cách tạm ứng, thanh toán khi đơn được nộp trước hoặc sau nghiệm thu, thời hạn và người chịu trách nhiệm đề xuất chi; số liệu chi thực tế chưa được thống kê. Quy chế chi tiêu nội bộ năm 2026 ghi nhận văn bằng khi được cấp và chưa có tiền thưởng cho văn bằng, trong khi bài báo quốc tế được thưởng ngay khi đăng; hoạt động khai thác có thu phí còn nhỏ, ứng với hạn chế thứ sáu tại Mục 2.5.2. Giải pháp này nhằm chuyển căn cứ chi hiện có thành một dòng dự toán vận hành được, điều chỉnh thời điểm ghi nhận văn bằng và chuẩn bị phương án tổ chức khai thác theo giai đoạn.</w:t>
       </w:r>
     </w:p>
     <w:p>
@@ -19477,7 +19490,7 @@
         <w:rPr>
           <w:szCs w:val="26"/>
         </w:rPr>
-        <w:t xml:space="preserve"> Lập dòng dự toán hằng năm cho phí xác lập quyền trong Quỹ nghiên cứu khoa học của Trường theo Chương VII Quyết định 213, trên cơ sở Điều 35 và Điều 38 Quyết định 213, phù hợp với điểm b khoản 2 Điều 66 Luật số 93/2025/QH15 và trách nhiệm thành lập quỹ phát triển khoa học và công nghệ tại điểm d khoản 3 Điều 28 Luật Giáo dục đại học số 125/2025/QH15. Dòng dự toán chi trả lệ phí nộp đơn, phí thẩm định, phí công bố, phí đại diện sở hữu công nghiệp cho các kết quả đã qua Khâu 5, kể cả khi đề tài đã quyết toán; quy định rõ người đề xuất chi là Phòng Khoa học Công nghệ, thời hạn đề xuất trong 15 ngày làm việc kể từ khi có phiếu rà soát, hình thức tạm ứng cho Bộ phận Pháp chế và hồ sơ thanh toán. Quy mô dự toán được tính từ số hồ sơ dự kiến nhân với mức phí theo quy định hiện hành về phí, lệ phí sở hữu công nghiệp, thay vì ấn định trước một tỷ lệ trích quỹ; tỷ lệ trích được để mở và điều chỉnh sau năm đầu. Sau khi đối chiếu văn bản Điều lệ, đề nghị bổ sung vào Điều lệ Quỹ Học bổng sau tiến sĩ Ngô Xuân Độ quy định cho phép hỗ trợ chi phí đăng ký đối với sản phẩm đề tài cấp cơ sở đã qua Khâu 5.</w:t>
+        <w:t xml:space="preserve"> Lập dòng dự toán hằng năm cho phí xác lập quyền trong Quỹ nghiên cứu khoa học của Trường theo Chương VII Quyết định 213, trên cơ sở Điều 35 và Điều 38 Quyết định 213, phù hợp với điểm b khoản 2 Điều 66 Luật số 93/2025/QH15 và trách nhiệm thành lập quỹ phát triển khoa học và công nghệ tại điểm d khoản 3 Điều 28 Luật Giáo dục đại học số 125/2025/QH15. Dòng dự toán chi trả lệ phí nộp đơn, phí thẩm định, phí công bố, phí đại diện sở hữu công nghiệp cho các kết quả đã được đánh giá khả năng bảo hộ tại Khâu 3 và có quyết định tại Khâu 6, trong thời gian thực hiện đề tài hoặc sau nghiệm thu, kể cả khi đề tài đã quyết toán; khoản chi cho đơn nộp trước nghiệm thu được chi từ dòng dự toán này, không trừ vào kinh phí của đề tài; quy định rõ người đề xuất chi là Phòng Khoa học Công nghệ, thời hạn đề xuất trong 15 ngày làm việc kể từ khi có kết quả đánh giá tại Khâu 3 đối với luồng sớm, hoặc từ khi có phiếu rà soát đối với luồng thường, hình thức tạm ứng cho Bộ phận Pháp chế và hồ sơ thanh toán. Quy mô dự toán được tính từ số hồ sơ dự kiến nhân với mức phí theo quy định hiện hành về phí, lệ phí sở hữu công nghiệp, thay vì ấn định trước một tỷ lệ trích quỹ; tỷ lệ trích được để mở và điều chỉnh sau năm đầu. Sau khi đối chiếu văn bản Điều lệ, đề nghị bổ sung vào Điều lệ Quỹ Học bổng sau tiến sĩ Ngô Xuân Độ quy định cho phép hỗ trợ chi phí đăng ký đối với sản phẩm đề tài cấp cơ sở đã được đánh giá tại Khâu 3, không phân biệt đã nghiệm thu hay chưa.</w:t>
       </w:r>
     </w:p>
     <w:p>
@@ -19517,7 +19530,7 @@
         <w:rPr>
           <w:szCs w:val="26"/>
         </w:rPr>
-        <w:t xml:space="preserve"> Chuẩn bị phương án tổ chức khai thác theo giai đoạn. Ở giai đoạn 1 và 2, việc định giá, đàm phán, ký hợp đồng chuyển giao được thực hiện qua Phòng Khoa học Công nghệ, Bộ phận Pháp chế và hợp đồng thuê tổ chức tư vấn bên ngoài. Việc xây dựng Đề án thành lập doanh nghiệp quản lý tài sản trí tuệ theo khoản 1 Điều 28 Luật Giáo dục đại học số 125/2025/QH15 chỉ được đặt ra khi đạt các điều kiện chuyển bước: danh mục có tài sản đã được cấp văn bằng và có đối tác quan tâm, đã có ít nhất một hợp đồng chuyển giao hoặc cấp phép được thực hiện, và phương án tài chính cho thấy doanh nghiệp có thể tự trang trải chi phí vận hành. Khi đó, doanh nghiệp có chức năng định giá tài sản trí tuệ theo phương pháp chi phí, phương pháp thu nhập và phương pháp thị trường; góp vốn bằng tài sản trí tuệ; đàm phán và ký kết hợp đồng chuyển nhượng, cấp phép sử dụng các đối tượng sở hữu trí tuệ của Nhà trường.</w:t>
+        <w:t xml:space="preserve"> Chuẩn bị phương án tổ chức khai thác theo giai đoạn. Ở giai đoạn 1 và 2, việc định giá, đàm phán, ký hợp đồng chuyển giao được thực hiện qua Phòng Khoa học Công nghệ, Bộ phận Pháp chế và hợp đồng thuê tổ chức tư vấn bên ngoài; hợp đồng với tổ chức trung gian, môi giới cần thỏa thuận rõ mức hưởng, vì khi không có thỏa thuận, khoản 2 Điều 34 Nghị định số 267/2025/NĐ-CP dành cho tổ chức này tối thiểu 10% lợi nhuận thu được. Việc xây dựng Đề án thành lập doanh nghiệp quản lý tài sản trí tuệ theo khoản 1 Điều 28 Luật Giáo dục đại học số 125/2025/QH15 chỉ được đặt ra khi đạt các điều kiện chuyển bước: danh mục có tài sản đã được cấp văn bằng và có đối tác quan tâm, đã có ít nhất một hợp đồng chuyển giao hoặc cấp phép được thực hiện, và phương án tài chính cho thấy doanh nghiệp có thể tự trang trải chi phí vận hành. Khi đó, doanh nghiệp có chức năng định giá tài sản trí tuệ theo phương pháp chi phí, phương pháp thu nhập và phương pháp thị trường; góp vốn bằng tài sản trí tuệ; đàm phán và ký kết hợp đồng chuyển nhượng, cấp phép sử dụng các đối tượng sở hữu trí tuệ của Nhà trường.</w:t>
       </w:r>
     </w:p>
     <w:p>
@@ -19718,7 +19731,7 @@
         <w:rPr>
           <w:szCs w:val="26"/>
         </w:rPr>
-        <w:t xml:space="preserve"> Phát hành Cẩm nang sở hữu trí tuệ dành cho giảng viên và sinh viên. Xây dựng Chuyên trang Cơ sở dữ liệu số tài sản trí tuệ trên cổng thông tin điện tử của Nhà trường để tôn vinh tác giả, minh bạch hóa thông tin và sẵn sàng kết nối với Nền tảng số quốc gia theo điểm đ khoản 3 Điều 28 Luật Giáo dục đại học số 125/2025/QH15 và cung cấp dữ liệu cho báo cáo trên HEMIS.</w:t>
+        <w:t xml:space="preserve"> Phát hành Cẩm nang sở hữu trí tuệ dành cho giảng viên và sinh viên. Xây dựng Chuyên trang giới thiệu tài sản trí tuệ trên cổng thông tin điện tử của Nhà trường để tôn vinh tác giả và giới thiệu tài sản sẵn sàng chuyển giao; chuyên trang chỉ đăng thông tin đã được phép công bố, tách khỏi danh mục số dùng cho quản lý nội bộ tại Giải pháp 3. Dữ liệu được phép công bố được trích từ danh mục số để kết nối với Nền tảng số quốc gia theo điểm đ khoản 3 Điều 28 Luật Giáo dục đại học số 125/2025/QH15 và cung cấp cho báo cáo trên HEMIS.</w:t>
       </w:r>
     </w:p>
     <w:p>
@@ -20487,7 +20500,7 @@
               <w:rPr>
                 <w:sz w:val="24"/>
               </w:rPr>
-              <w:t xml:space="preserve">Thời gian từ phiếu đến nộp đơn; chỉ số 12, 13 tại Bảng 3.4; điều kiện chuyển bước</w:t>
+              <w:t xml:space="preserve">Thời gian từ kết quả Khâu 3 đến nộp đơn, kể cả đơn nộp trước nghiệm thu; chỉ số 12, 13 tại Bảng 3.4; điều kiện chuyển bước</w:t>
             </w:r>
           </w:p>
         </w:tc>
@@ -20692,20 +20705,20 @@
         <w:rPr>
           <w:szCs w:val="26"/>
         </w:rPr>
-        <w:t xml:space="preserve">Thí điểm dưới đây là kế hoạch, chưa được triển khai. Để bảo đảm tính khả thi và giảm rủi ro khi áp dụng toàn trường, Đề tài đề xuất thí điểm Khâu 1, Khâu 4 và Khâu 5 của quy trình, gồm phiếu khai báo, xem xét bảo mật trước khi công bố và phiếu rà soát tại nghiệm thu, trước khi trình ban hành chính thức. Phạm vi dự kiến là các đề tài cấp cơ sở năm 2026 của Viện Y - Dược, nơi phát sinh 9 trên 11 sản phẩm tiềm năng giai đoạn 2021 - 2025 và đơn sáng chế duy nhất trong kỳ; Viện Nghiên cứu giáo dục và Chuyển giao tri thức tham gia với vai trò hỗ trợ khai thác. Thời gian dự kiến từ quý IV năm 2026 đến quý II năm 2027.</w:t>
-      </w:r>
-    </w:p>
-    <w:p>
-      <w:pPr>
-        <w:rPr>
-          <w:szCs w:val="26"/>
-        </w:rPr>
-      </w:pPr>
-      <w:r>
-        <w:rPr>
-          <w:szCs w:val="26"/>
-        </w:rPr>
-        <w:t xml:space="preserve">Mục đích của việc thí điểm bao gồm: kiểm chứng tính khả thi và mức độ phù hợp của phiếu khai báo, phiếu rà soát; đo thời gian bổ sung cho mỗi phiên nghiệm thu; thu thập phản hồi của Hội đồng nghiệm thu và chủ nhiệm đề tài; phát hiện và điều chỉnh các điểm vướng mắc trước khi áp dụng toàn trường. Sản phẩm đầu ra là báo cáo đánh giá thí điểm, nêu số phiếu, số kết quả được sàng lọc, số đề xuất đăng ký, số đơn được nộp và thời gian xử lý.</w:t>
+        <w:t xml:space="preserve">Thí điểm dưới đây là kế hoạch, chưa được triển khai. Để bảo đảm tính khả thi và giảm rủi ro khi áp dụng toàn trường, Đề tài đề xuất thí điểm Khâu 1, Khâu 4, Khâu 5 và luồng sớm từ Khâu 3 sang Khâu 6 của quy trình, gồm phiếu khai báo, xem xét bảo mật trước khi công bố, quyết định đăng ký và cấp kinh phí trước nghiệm thu khi cần, và phiếu rà soát tại nghiệm thu, trước khi trình ban hành chính thức. Phạm vi dự kiến là các đề tài cấp cơ sở năm 2026 của Viện Y - Dược, nơi phát sinh 9 trên 11 sản phẩm tiềm năng giai đoạn 2021 - 2025 và đơn sáng chế duy nhất trong kỳ; Viện Nghiên cứu giáo dục và Chuyển giao tri thức tham gia với vai trò hỗ trợ khai thác. Thời gian dự kiến từ quý IV năm 2026 đến quý II năm 2027.</w:t>
+      </w:r>
+    </w:p>
+    <w:p>
+      <w:pPr>
+        <w:rPr>
+          <w:szCs w:val="26"/>
+        </w:rPr>
+      </w:pPr>
+      <w:r>
+        <w:rPr>
+          <w:szCs w:val="26"/>
+        </w:rPr>
+        <w:t xml:space="preserve">Mục đích của việc thí điểm bao gồm: kiểm chứng tính khả thi và mức độ phù hợp của phiếu khai báo, phiếu rà soát; đo thời gian bổ sung cho mỗi phiên nghiệm thu; thu thập phản hồi của Hội đồng nghiệm thu và chủ nhiệm đề tài; phát hiện và điều chỉnh các điểm vướng mắc trước khi áp dụng toàn trường. Sản phẩm đầu ra là báo cáo đánh giá thí điểm, nêu số phiếu, số kết quả được sàng lọc, số đề xuất đăng ký, số đơn được nộp theo từng luồng và thời gian xử lý của mỗi luồng.</w:t>
       </w:r>
     </w:p>
     <w:p>
@@ -20931,7 +20944,7 @@
         <w:rPr>
           <w:szCs w:val="26"/>
         </w:rPr>
-        <w:t xml:space="preserve">- Ban hành Quy chế quản trị tài sản trí tuệ sửa đổi trước ngày 31 tháng 5 năm 2027, trong đó xác định phạm vi và thứ tự áp dụng các quy định về lợi ích của tác giả theo Điều 28, Điều 73 Luật số 93/2025/QH15 và Điều 135 Luật Sở hữu trí tuệ, hoàn thiện nội dung liêm chính khoa học, liêm chính học thuật.</w:t>
+        <w:t xml:space="preserve">- Ban hành Quy chế quản trị tài sản trí tuệ sửa đổi trước ngày 31 tháng 5 năm 2027, trong đó xác định phạm vi và thứ tự áp dụng các quy định về lợi ích của tác giả theo Điều 28, Điều 73 Luật số 93/2025/QH15, Điều 32, Điều 34 Nghị định số 267/2025/NĐ-CP và Điều 135 Luật Sở hữu trí tuệ, hoàn thiện nội dung liêm chính khoa học, liêm chính học thuật.</w:t>
       </w:r>
     </w:p>
     <w:p>
@@ -21088,7 +21101,7 @@
         <w:rPr>
           <w:szCs w:val="26"/>
         </w:rPr>
-        <w:t xml:space="preserve">- Hoàn thiện Chuyên trang Cơ sở dữ liệu số tài sản trí tuệ, sẵn sàng kết nối với Nền tảng số quốc gia.</w:t>
+        <w:t xml:space="preserve">- Hoàn thiện danh mục số tài sản trí tuệ có phân quyền truy cập; chuẩn bị trích xuất dữ liệu được phép công bố để kết nối với Nền tảng số quốc gia và báo cáo trên HEMIS.</w:t>
       </w:r>
     </w:p>
     <w:p>
@@ -21193,7 +21206,7 @@
         <w:rPr>
           <w:szCs w:val="26"/>
         </w:rPr>
-        <w:t xml:space="preserve">- Số hóa toàn bộ dữ liệu tài sản trí tuệ và công khai minh bạch hằng năm trên Nền tảng số quốc gia.</w:t>
+        <w:t xml:space="preserve">- Số hóa đầy đủ dữ liệu tài sản trí tuệ để quản lý nội bộ; hằng năm chỉ công khai dữ liệu được phép công bố, gồm văn bằng đã cấp, đơn đã được công bố chính thức và số liệu tổng hợp; hồ sơ chưa nộp đơn, bí mật kinh doanh và thông tin bị ràng buộc bởi hợp đồng được giới hạn quyền truy cập.</w:t>
       </w:r>
     </w:p>
     <w:p>
@@ -21568,7 +21581,7 @@
               <w:rPr>
                 <w:sz w:val="24"/>
               </w:rPr>
-              <w:t xml:space="preserve">7. Thời gian từ phiếu rà soát đến quyết định xác lập quyền</w:t>
+              <w:t xml:space="preserve">7. Thời gian từ khi có kết quả đánh giá tại Khâu 3 đến quyết định xác lập quyền, tách theo luồng sớm và luồng thường</w:t>
             </w:r>
           </w:p>
         </w:tc>
@@ -21960,7 +21973,7 @@
               <w:rPr>
                 <w:sz w:val="24"/>
               </w:rPr>
-              <w:t xml:space="preserve">Theo dõi và công khai hằng năm</w:t>
+              <w:t xml:space="preserve">Theo dõi hằng năm; công khai số liệu tổng hợp</w:t>
             </w:r>
           </w:p>
         </w:tc>
@@ -22099,20 +22112,20 @@
         <w:rPr>
           <w:szCs w:val="26"/>
         </w:rPr>
-        <w:t xml:space="preserve">Về thực trạng, Trường Đại học Thành Đô có tầm nhìn thể chế sớm, năng lực công bố tăng nhanh, 11 hồ sơ tài sản trí tuệ trong kỳ 2021 - 2025, trong đó 4 tài sản đã được cấp văn bằng, giấy chứng nhận và 5 kiểu dáng công nghiệp cần xác nhận trạng thái, và chiến lược hợp tác đại học với doanh nghiệp mà Ban Giám hiệu đã dày công kết nối đã mang lại thành công nổi bật. Tiềm năng tài sản trí tuệ là rõ ràng, đặc biệt ở khối ngành Y - Dược, với 11 trên 38 đề tài có sản phẩm tiềm năng, trong đó 9 thuộc sở hữu công nghiệp nhưng mới 1 đề tài có đơn. Độ trễ thể chế trước sự thay đổi dồn dập của pháp luật quốc gia giai đoạn 2025 - 2026 làm phát sinh nhu cầu rà soát phạm vi áp dụng của quy chế từ cuối năm 2025; đối với kết quả của kỳ đánh giá, Đề tài nhận định nguyên nhân chủ quan cốt lõi là khoảng trống kỹ thuật: thiếu một biểu mẫu rà soát tại thời điểm nghiệm thu, cùng với việc chưa có dự toán riêng cho bước đăng ký và chưa thống nhất cách hiểu, thứ tự áp dụng các quy định về lợi ích của tác giả. Đề tài cũng xác định các quy định nội bộ không xung đột trong cùng một tình huống, và mức trần 100 triệu đồng tại Quyết định 213 chỉ cần sửa đối với các trường hợp thuộc phạm vi Điều 28 Luật số 93/2025/QH15.</w:t>
-      </w:r>
-    </w:p>
-    <w:p>
-      <w:pPr>
-        <w:rPr>
-          <w:szCs w:val="26"/>
-        </w:rPr>
-      </w:pPr>
-      <w:r>
-        <w:rPr>
-          <w:szCs w:val="26"/>
-        </w:rPr>
-        <w:t xml:space="preserve">Về giải pháp, Đề tài đề xuất năm nhóm giải pháp đồng bộ: hoàn thiện quy chế với cơ chế lợi ích của tác giả theo nguồn hình thành tài sản, thời điểm giao nhiệm vụ và loại đối tượng; giao đầu mối, cơ chế phối hợp và bố trí nhân sự theo giai đoạn; chuẩn hóa quy trình 8 khâu với khai báo, sàng lọc, xem xét bảo mật trước khi công bố và phiếu rà soát tại nghiệm thu; lập dòng dự toán cho bước xác lập quyền và chuẩn bị phương án khai thác theo điều kiện chuyển bước; phát triển đào tạo và văn hóa sở hữu trí tuệ. Các giải pháp đi kèm kế hoạch thí điểm tại Viện Y - Dược, lộ trình ba giai đoạn đến năm 2030 và bộ chỉ số phân tầng từ sàng lọc, đơn nộp, văn bằng đến khai thác.</w:t>
+        <w:t xml:space="preserve">Về thực trạng, Trường Đại học Thành Đô có tầm nhìn thể chế sớm, năng lực công bố tăng nhanh, 11 hồ sơ tài sản trí tuệ trong kỳ 2021 - 2025, trong đó 4 tài sản đã được cấp văn bằng, giấy chứng nhận và 5 kiểu dáng công nghiệp cần xác nhận trạng thái, và chiến lược hợp tác đại học với doanh nghiệp mà Ban Giám hiệu đã dày công kết nối đã mang lại thành công nổi bật. Tiềm năng tài sản trí tuệ là rõ ràng, đặc biệt ở khối ngành Y - Dược, với 11 trên 38 đề tài có sản phẩm tiềm năng, trong đó 9 thuộc sở hữu công nghiệp nhưng mới 1 đề tài có đơn. Độ trễ thể chế trước sự thay đổi dồn dập của pháp luật quốc gia giai đoạn 2025 - 2026 làm phát sinh nhu cầu rà soát phạm vi áp dụng của quy chế từ cuối năm 2025. Đối với kết quả của kỳ đánh giá, hồ sơ hiện có chưa đủ để xác định nguyên nhân chính; Đề tài nêu các yếu tố có thể đang cản trở và cần được kiểm chứng: trong hồ sơ được tiếp cận chưa thấy biểu mẫu rà soát khả năng bảo hộ tại nghiệm thu và chưa thấy dự toán riêng cho bước đăng ký; cách hiểu và thứ tự áp dụng các quy định về lợi ích của tác giả chưa được thống nhất. Qua đối chiếu theo từng tình huống, Đề tài chưa xác định được trường hợp các quy định nội bộ áp dụng không tương thích cho cùng một tài sản, nhưng phạm vi và thứ tự áp dụng chưa được làm rõ; mức trần 100 triệu đồng tại Quyết định 213 cần được rà soát đối với các trường hợp thuộc phạm vi Điều 28 Luật số 93/2025/QH15 và Điều 34 Nghị định số 267/2025/NĐ-CP.</w:t>
+      </w:r>
+    </w:p>
+    <w:p>
+      <w:pPr>
+        <w:rPr>
+          <w:szCs w:val="26"/>
+        </w:rPr>
+      </w:pPr>
+      <w:r>
+        <w:rPr>
+          <w:szCs w:val="26"/>
+        </w:rPr>
+        <w:t xml:space="preserve">Về giải pháp, Đề tài đề xuất năm nhóm giải pháp đồng bộ: hoàn thiện quy chế với cơ chế lợi ích của tác giả theo nguồn hình thành tài sản, thời điểm giao nhiệm vụ và loại đối tượng; giao đầu mối, cơ chế phối hợp và bố trí nhân sự theo giai đoạn; chuẩn hóa quy trình 8 khâu với khai báo, sàng lọc, xem xét bảo mật trước khi công bố, luồng nộp đơn sớm không chờ nghiệm thu và bước kiểm tra tại nghiệm thu; lập dòng dự toán cho bước xác lập quyền và chuẩn bị phương án khai thác theo điều kiện chuyển bước; phát triển đào tạo và văn hóa sở hữu trí tuệ. Các giải pháp đi kèm kế hoạch thí điểm tại Viện Y - Dược, lộ trình ba giai đoạn đến năm 2030 và bộ chỉ số phân tầng từ sàng lọc, đơn nộp, văn bằng đến khai thác.</w:t>
       </w:r>
     </w:p>
     <w:p>
@@ -22142,7 +22155,7 @@
         <w:rPr>
           <w:szCs w:val="26"/>
         </w:rPr>
-        <w:t xml:space="preserve">Bộ Khoa học và Công nghệ sớm ban hành văn bản hướng dẫn thi hành Điều 25, Điều 27 và Điều 28 Luật số 93/2025/QH15 đối với tổ chức khoa học và công nghệ ngoài công lập, nhất là cách xác định lợi nhuận làm căn cứ thưởng tác giả và thủ tục góp vốn bằng tài sản trí tuệ. Bộ Giáo dục và Đào tạo có hướng dẫn cách tính các chỉ số về sở hữu trí tuệ và thu từ khoa học công nghệ trong Chuẩn cơ sở giáo dục đại học ban hành kèm Thông tư số 83/2026/TT-BGDĐT. Cục Sở hữu trí tuệ mở rộng chương trình tập huấn và cơ chế hỗ trợ phí nộp đơn cho cơ sở giáo dục đại học tư thục.</w:t>
+        <w:t xml:space="preserve">Nghị định số 267/2025/NĐ-CP đã quy định chi tiết việc giao quyền, thương mại hóa và phân chia lợi nhuận đối với kết quả nhiệm vụ sử dụng ngân sách nhà nước, kể cả với tổ chức chủ trì ngoài công lập. Trên cơ sở đối chiếu, Đề tài kiến nghị Bộ Khoa học và Công nghệ hướng dẫn bổ sung hai vấn đề mà quy định hiện hành chưa nêu rõ cho trường hợp của đề tài: một là, phương pháp xác định lợi nhuận sau thuế tương ứng với một kết quả cụ thể, làm căn cứ thưởng tác giả theo khoản 3 Điều 28 Luật số 93/2025/QH15, khi kết quả được hình thành từ cả kinh phí ngân sách nhà nước và kinh phí đối ứng của tổ chức chủ trì; hai là, cơ sở tính mức tối thiểu 10% cho tổ chức trung gian, môi giới tại khoản 2 Điều 34 Nghị định, vì quy định vừa nêu lợi nhuận thu được vừa nêu giá trị của hợp đồng. Bộ Giáo dục và Đào tạo có hướng dẫn cách tính các chỉ số về sở hữu trí tuệ và thu từ khoa học công nghệ trong Chuẩn cơ sở giáo dục đại học ban hành kèm Thông tư số 83/2026/TT-BGDĐT. Cục Sở hữu trí tuệ mở rộng chương trình tập huấn và cơ chế hỗ trợ phí nộp đơn cho cơ sở giáo dục đại học tư thục.</w:t>
       </w:r>
     </w:p>
     <w:p>
@@ -22172,20 +22185,20 @@
         <w:rPr>
           <w:szCs w:val="26"/>
         </w:rPr>
-        <w:t xml:space="preserve">Thứ nhất, chỉ đạo hoàn thiện Quy chế quản trị tài sản trí tuệ trên nền Quyết định 217, hợp nhất các quy định về sở hữu trí tuệ của Quyết định 213 và thống nhất với Quy chế chi tiêu nội bộ, trong đó xác định phạm vi và thứ tự áp dụng các quy định về lợi ích của tác giả, phân biệt thưởng, thù lao, nhuận bút, và bảo đảm mức tối thiểu theo Điều 28 Luật số 93/2025/QH15 cho các trường hợp thuộc phạm vi áp dụng của Luật.</w:t>
-      </w:r>
-    </w:p>
-    <w:p>
-      <w:pPr>
-        <w:rPr>
-          <w:szCs w:val="26"/>
-        </w:rPr>
-      </w:pPr>
-      <w:r>
-        <w:rPr>
-          <w:szCs w:val="26"/>
-        </w:rPr>
-        <w:t xml:space="preserve">Thứ hai, bổ sung phiếu khai báo và phiếu rà soát vào các biểu mẫu đề xuất, thuyết minh, hợp đồng, nghiệm thu hiện có; rà soát tình trạng bộc lộ của 6 đề tài mã số 2021 - 2024 có sản phẩm tiềm năng sở hữu công nghiệp và xác nhận trạng thái pháp lý của 5 kiểu dáng công nghiệp.</w:t>
+        <w:t xml:space="preserve">Thứ nhất, chỉ đạo hoàn thiện Quy chế quản trị tài sản trí tuệ trên nền Quyết định 217, hợp nhất các quy định về sở hữu trí tuệ của Quyết định 213 và thống nhất với Quy chế chi tiêu nội bộ, trong đó xác định phạm vi và thứ tự áp dụng các quy định về lợi ích của tác giả, phân biệt thưởng, thù lao, nhuận bút, bảo đảm mức tối thiểu theo Điều 28 Luật số 93/2025/QH15 cho các trường hợp thuộc phạm vi áp dụng của Luật, và quy định cách xác định lợi nhuận, mẫu thỏa thuận chia thưởng giữa các đồng tác giả theo Điều 34 Nghị định số 267/2025/NĐ-CP.</w:t>
+      </w:r>
+    </w:p>
+    <w:p>
+      <w:pPr>
+        <w:rPr>
+          <w:szCs w:val="26"/>
+        </w:rPr>
+      </w:pPr>
+      <w:r>
+        <w:rPr>
+          <w:szCs w:val="26"/>
+        </w:rPr>
+        <w:t xml:space="preserve">Thứ hai, bổ sung phiếu khai báo và phiếu rà soát vào các biểu mẫu đề xuất, thuyết minh, hợp đồng, nghiệm thu hiện có; cho phép quyết định đăng ký và cấp kinh phí ngay trong quá trình nghiên cứu khi kết quả cần được bảo vệ trước khi công bố; quản lý danh mục số tài sản trí tuệ có phân quyền và chỉ công khai dữ liệu được phép công bố; rà soát tình trạng bộc lộ của 6 đề tài mã số 2021 - 2024 có sản phẩm tiềm năng sở hữu công nghiệp và xác nhận trạng thái pháp lý của 5 kiểu dáng công nghiệp.</w:t>
       </w:r>
     </w:p>
     <w:p>
@@ -22374,14 +22387,14 @@
         <w:rPr>
           <w:szCs w:val="26"/>
         </w:rPr>
-        <w:t xml:space="preserve">Chính phủ. (2026). </w:t>
+        <w:t xml:space="preserve">Chính phủ. (2025). </w:t>
       </w:r>
       <w:r>
         <w:rPr>
           <w:szCs w:val="26"/>
           <w:i/>
         </w:rPr>
-        <w:t xml:space="preserve">Nghị định số 134/2026/NĐ-CP ngày 06 tháng 4 năm 2026 sửa đổi, bổ sung một số điều của Nghị định số 17/2023/NĐ-CP quy định chi tiết một số điều và biện pháp thi hành Luật Sở hữu trí tuệ về quyền tác giả, quyền liên quan</w:t>
+        <w:t xml:space="preserve">Nghị định số 267/2025/NĐ-CP ngày 14 tháng 10 năm 2025 quy định chi tiết và hướng dẫn một số điều của Luật Khoa học, công nghệ và đổi mới sáng tạo về chương trình, nhiệm vụ khoa học, công nghệ và đổi mới sáng tạo và một số quy định về thúc đẩy hoạt động nghiên cứu khoa học, phát triển công nghệ và đổi mới sáng tạo</w:t>
       </w:r>
       <w:r>
         <w:rPr>
@@ -22402,14 +22415,14 @@
         <w:rPr>
           <w:szCs w:val="26"/>
         </w:rPr>
-        <w:t xml:space="preserve">Quốc hội. (2009). </w:t>
+        <w:t xml:space="preserve">Chính phủ. (2026). </w:t>
       </w:r>
       <w:r>
         <w:rPr>
           <w:szCs w:val="26"/>
           <w:i/>
         </w:rPr>
-        <w:t xml:space="preserve">Luật số 36/2009/QH12 ngày 19 tháng 6 năm 2009 sửa đổi, bổ sung một số điều của Luật Sở hữu trí tuệ</w:t>
+        <w:t xml:space="preserve">Nghị định số 134/2026/NĐ-CP ngày 06 tháng 4 năm 2026 sửa đổi, bổ sung một số điều của Nghị định số 17/2023/NĐ-CP quy định chi tiết một số điều và biện pháp thi hành Luật Sở hữu trí tuệ về quyền tác giả, quyền liên quan</w:t>
       </w:r>
       <w:r>
         <w:rPr>
@@ -22430,14 +22443,14 @@
         <w:rPr>
           <w:szCs w:val="26"/>
         </w:rPr>
-        <w:t xml:space="preserve">Quốc hội. (2017). </w:t>
+        <w:t xml:space="preserve">Quốc hội. (2009). </w:t>
       </w:r>
       <w:r>
         <w:rPr>
           <w:szCs w:val="26"/>
           <w:i/>
         </w:rPr>
-        <w:t xml:space="preserve">Luật Chuyển giao công nghệ số 07/2017/QH14 ngày 19 tháng 6 năm 2017</w:t>
+        <w:t xml:space="preserve">Luật số 36/2009/QH12 ngày 19 tháng 6 năm 2009 sửa đổi, bổ sung một số điều của Luật Sở hữu trí tuệ</w:t>
       </w:r>
       <w:r>
         <w:rPr>
@@ -22458,14 +22471,14 @@
         <w:rPr>
           <w:szCs w:val="26"/>
         </w:rPr>
-        <w:t xml:space="preserve">Quốc hội. (2025a). </w:t>
+        <w:t xml:space="preserve">Quốc hội. (2017). </w:t>
       </w:r>
       <w:r>
         <w:rPr>
           <w:szCs w:val="26"/>
           <w:i/>
         </w:rPr>
-        <w:t xml:space="preserve">Luật Giáo dục đại học số 125/2025/QH15 ngày 10 tháng 12 năm 2025</w:t>
+        <w:t xml:space="preserve">Luật Chuyển giao công nghệ số 07/2017/QH14 ngày 19 tháng 6 năm 2017</w:t>
       </w:r>
       <w:r>
         <w:rPr>
@@ -22486,14 +22499,14 @@
         <w:rPr>
           <w:szCs w:val="26"/>
         </w:rPr>
-        <w:t xml:space="preserve">Quốc hội. (2025b). </w:t>
+        <w:t xml:space="preserve">Quốc hội. (2025a). </w:t>
       </w:r>
       <w:r>
         <w:rPr>
           <w:szCs w:val="26"/>
           <w:i/>
         </w:rPr>
-        <w:t xml:space="preserve">Luật Khoa học, công nghệ và đổi mới sáng tạo số 93/2025/QH15 ngày 27 tháng 6 năm 2025</w:t>
+        <w:t xml:space="preserve">Luật Giáo dục đại học số 125/2025/QH15 ngày 10 tháng 12 năm 2025</w:t>
       </w:r>
       <w:r>
         <w:rPr>
@@ -22514,14 +22527,14 @@
         <w:rPr>
           <w:szCs w:val="26"/>
         </w:rPr>
-        <w:t xml:space="preserve">Quốc hội. (2025c). </w:t>
+        <w:t xml:space="preserve">Quốc hội. (2025b). </w:t>
       </w:r>
       <w:r>
         <w:rPr>
           <w:szCs w:val="26"/>
           <w:i/>
         </w:rPr>
-        <w:t xml:space="preserve">Luật số 123/2025/QH15 ngày 10 tháng 12 năm 2025 sửa đổi, bổ sung một số điều của Luật Giáo dục</w:t>
+        <w:t xml:space="preserve">Luật Khoa học, công nghệ và đổi mới sáng tạo số 93/2025/QH15 ngày 27 tháng 6 năm 2025</w:t>
       </w:r>
       <w:r>
         <w:rPr>
@@ -22542,14 +22555,14 @@
         <w:rPr>
           <w:szCs w:val="26"/>
         </w:rPr>
-        <w:t xml:space="preserve">Quốc hội. (2025d). </w:t>
+        <w:t xml:space="preserve">Quốc hội. (2025c). </w:t>
       </w:r>
       <w:r>
         <w:rPr>
           <w:szCs w:val="26"/>
           <w:i/>
         </w:rPr>
-        <w:t xml:space="preserve">Luật số 131/2025/QH15 ngày 10 tháng 12 năm 2025 sửa đổi, bổ sung một số điều của Luật Sở hữu trí tuệ</w:t>
+        <w:t xml:space="preserve">Luật số 123/2025/QH15 ngày 10 tháng 12 năm 2025 sửa đổi, bổ sung một số điều của Luật Giáo dục</w:t>
       </w:r>
       <w:r>
         <w:rPr>
@@ -22570,14 +22583,14 @@
         <w:rPr>
           <w:szCs w:val="26"/>
         </w:rPr>
-        <w:t xml:space="preserve">Thủ tướng Chính phủ. (2019). </w:t>
+        <w:t xml:space="preserve">Quốc hội. (2025d). </w:t>
       </w:r>
       <w:r>
         <w:rPr>
           <w:szCs w:val="26"/>
           <w:i/>
         </w:rPr>
-        <w:t xml:space="preserve">Quyết định số 1068/QĐ-TTg ngày 22 tháng 8 năm 2019 phê duyệt Chiến lược sở hữu trí tuệ đến năm 2030</w:t>
+        <w:t xml:space="preserve">Luật số 131/2025/QH15 ngày 10 tháng 12 năm 2025 sửa đổi, bổ sung một số điều của Luật Sở hữu trí tuệ</w:t>
       </w:r>
       <w:r>
         <w:rPr>
@@ -22598,14 +22611,14 @@
         <w:rPr>
           <w:szCs w:val="26"/>
         </w:rPr>
-        <w:t xml:space="preserve">Thủ tướng Chính phủ. (2026a). </w:t>
+        <w:t xml:space="preserve">Thủ tướng Chính phủ. (2019). </w:t>
       </w:r>
       <w:r>
         <w:rPr>
           <w:szCs w:val="26"/>
           <w:i/>
         </w:rPr>
-        <w:t xml:space="preserve">Chỉ thị số 02/CT-TTg ngày 30 tháng 01 năm 2026 về tăng cường thực thi quyền sở hữu trí tuệ</w:t>
+        <w:t xml:space="preserve">Quyết định số 1068/QĐ-TTg ngày 22 tháng 8 năm 2019 phê duyệt Chiến lược sở hữu trí tuệ đến năm 2030</w:t>
       </w:r>
       <w:r>
         <w:rPr>
@@ -22626,14 +22639,14 @@
         <w:rPr>
           <w:szCs w:val="26"/>
         </w:rPr>
-        <w:t xml:space="preserve">Thủ tướng Chính phủ. (2026b). </w:t>
+        <w:t xml:space="preserve">Thủ tướng Chính phủ. (2026a). </w:t>
       </w:r>
       <w:r>
         <w:rPr>
           <w:szCs w:val="26"/>
           <w:i/>
         </w:rPr>
-        <w:t xml:space="preserve">Quyết định số 1624/QĐ-TTg ngày 21 tháng 8 năm 2026 sửa đổi, bổ sung một số điều của Quyết định số 1068/QĐ-TTg ngày 22 tháng 8 năm 2019 phê duyệt Chiến lược sở hữu trí tuệ đến năm 2030</w:t>
+        <w:t xml:space="preserve">Chỉ thị số 02/CT-TTg ngày 30 tháng 01 năm 2026 về tăng cường thực thi quyền sở hữu trí tuệ</w:t>
       </w:r>
       <w:r>
         <w:rPr>
@@ -22654,14 +22667,14 @@
         <w:rPr>
           <w:szCs w:val="26"/>
         </w:rPr>
-        <w:t xml:space="preserve">Trường Đại học Thành Đô. (2021). </w:t>
+        <w:t xml:space="preserve">Thủ tướng Chính phủ. (2026b). </w:t>
       </w:r>
       <w:r>
         <w:rPr>
           <w:szCs w:val="26"/>
           <w:i/>
         </w:rPr>
-        <w:t xml:space="preserve">Quyết định số 213/QĐ-ĐHTĐ ngày 28 tháng 12 năm 2021 ban hành Quy chế hoạt động khoa học công nghệ Trường Đại học Thành Đô</w:t>
+        <w:t xml:space="preserve">Quyết định số 1624/QĐ-TTg ngày 21 tháng 8 năm 2026 sửa đổi, bổ sung một số điều của Quyết định số 1068/QĐ-TTg ngày 22 tháng 8 năm 2019 phê duyệt Chiến lược sở hữu trí tuệ đến năm 2030</w:t>
       </w:r>
       <w:r>
         <w:rPr>
@@ -22682,14 +22695,14 @@
         <w:rPr>
           <w:szCs w:val="26"/>
         </w:rPr>
-        <w:t xml:space="preserve">Trường Đại học Thành Đô. (2024a). </w:t>
+        <w:t xml:space="preserve">Trường Đại học Thành Đô. (2021). </w:t>
       </w:r>
       <w:r>
         <w:rPr>
           <w:szCs w:val="26"/>
           <w:i/>
         </w:rPr>
-        <w:t xml:space="preserve">Kế hoạch số 07/KH-ĐHTĐ ngày 01 tháng 7 năm 2024 về hoạt động khoa học công nghệ giai đoạn 2024 - 2028</w:t>
+        <w:t xml:space="preserve">Quyết định số 213/QĐ-ĐHTĐ ngày 28 tháng 12 năm 2021 ban hành Quy chế hoạt động khoa học công nghệ Trường Đại học Thành Đô</w:t>
       </w:r>
       <w:r>
         <w:rPr>
@@ -22710,14 +22723,14 @@
         <w:rPr>
           <w:szCs w:val="26"/>
         </w:rPr>
-        <w:t xml:space="preserve">Trường Đại học Thành Đô. (2024b). </w:t>
+        <w:t xml:space="preserve">Trường Đại học Thành Đô. (2024a). </w:t>
       </w:r>
       <w:r>
         <w:rPr>
           <w:szCs w:val="26"/>
           <w:i/>
         </w:rPr>
-        <w:t xml:space="preserve">Quyết định số 217/QĐ-ĐHTĐ ngày 21 tháng 11 năm 2024 ban hành Quy chế quản trị tài sản trí tuệ tại Trường Đại học Thành Đô</w:t>
+        <w:t xml:space="preserve">Kế hoạch số 07/KH-ĐHTĐ ngày 01 tháng 7 năm 2024 về hoạt động khoa học công nghệ giai đoạn 2024 - 2028</w:t>
       </w:r>
       <w:r>
         <w:rPr>
@@ -22738,14 +22751,14 @@
         <w:rPr>
           <w:szCs w:val="26"/>
         </w:rPr>
-        <w:t xml:space="preserve">Trường Đại học Thành Đô. (2025). </w:t>
+        <w:t xml:space="preserve">Trường Đại học Thành Đô. (2024b). </w:t>
       </w:r>
       <w:r>
         <w:rPr>
           <w:szCs w:val="26"/>
           <w:i/>
         </w:rPr>
-        <w:t xml:space="preserve">Điều lệ Quỹ Học bổng sau tiến sĩ Ngô Xuân Độ</w:t>
+        <w:t xml:space="preserve">Quyết định số 217/QĐ-ĐHTĐ ngày 21 tháng 11 năm 2024 ban hành Quy chế quản trị tài sản trí tuệ tại Trường Đại học Thành Đô</w:t>
       </w:r>
       <w:r>
         <w:rPr>
@@ -22766,20 +22779,20 @@
         <w:rPr>
           <w:szCs w:val="26"/>
         </w:rPr>
-        <w:t xml:space="preserve">Trường Đại học Thành Đô. (2026). </w:t>
+        <w:t xml:space="preserve">Trường Đại học Thành Đô. (2025). </w:t>
       </w:r>
       <w:r>
         <w:rPr>
           <w:szCs w:val="26"/>
           <w:i/>
         </w:rPr>
-        <w:t xml:space="preserve">Quy chế chi tiêu nội bộ Trường Đại học Thành Đô</w:t>
-      </w:r>
-      <w:r>
-        <w:rPr>
-          <w:szCs w:val="26"/>
-        </w:rPr>
-        <w:t xml:space="preserve"> (Ban hành theo Nghị quyết số 02/NQ-HĐT-ĐHTĐ ngày 01 tháng 6 năm 2026).</w:t>
+        <w:t xml:space="preserve">Điều lệ Quỹ Học bổng sau tiến sĩ Ngô Xuân Độ</w:t>
+      </w:r>
+      <w:r>
+        <w:rPr>
+          <w:szCs w:val="26"/>
+        </w:rPr>
+        <w:t xml:space="preserve">.</w:t>
       </w:r>
     </w:p>
     <w:p>
@@ -22794,6 +22807,34 @@
         <w:rPr>
           <w:szCs w:val="26"/>
         </w:rPr>
+        <w:t xml:space="preserve">Trường Đại học Thành Đô. (2026). </w:t>
+      </w:r>
+      <w:r>
+        <w:rPr>
+          <w:szCs w:val="26"/>
+          <w:i/>
+        </w:rPr>
+        <w:t xml:space="preserve">Quy chế chi tiêu nội bộ Trường Đại học Thành Đô</w:t>
+      </w:r>
+      <w:r>
+        <w:rPr>
+          <w:szCs w:val="26"/>
+        </w:rPr>
+        <w:t xml:space="preserve"> (Ban hành theo Nghị quyết số 02/NQ-HĐT-ĐHTĐ ngày 01 tháng 6 năm 2026).</w:t>
+      </w:r>
+    </w:p>
+    <w:p>
+      <w:pPr>
+        <w:spacing w:after="80"/>
+        <w:ind w:left="560" w:hanging="560"/>
+        <w:rPr>
+          <w:szCs w:val="26"/>
+        </w:rPr>
+      </w:pPr>
+      <w:r>
+        <w:rPr>
+          <w:szCs w:val="26"/>
+        </w:rPr>
         <w:t xml:space="preserve">Văn phòng Quốc hội. (2026). </w:t>
       </w:r>
       <w:r>
@@ -22929,7 +22970,7 @@
           <w:szCs w:val="26"/>
           <w:i/>
         </w:rPr>
-        <w:t xml:space="preserve">Tạp chí Khoa học Đại học Mở Hà Nội</w:t>
+        <w:t xml:space="preserve">Tạp chí Khoa học Trường Đại học Mở Hà Nội</w:t>
       </w:r>
       <w:r>
         <w:rPr>

</xml_diff>